<commit_message>
Update resume, portfolio content, logo, and hero star
</commit_message>
<xml_diff>
--- a/assets/downloads/Angel-Delgado-Resume.docx
+++ b/assets/downloads/Angel-Delgado-Resume.docx
@@ -83,7 +83,7 @@
           <w:sz w:val="22"/>
           <w:szCs w:val="22"/>
         </w:rPr>
-        <w:t>Aspiring Software Developer | Mobile, Embedded &amp; Data Analytics</w:t>
+        <w:t xml:space="preserve">Web Developer | UI/UX | Data Analytics</w:t>
       </w:r>
     </w:p>
     <w:p>
@@ -164,7 +164,7 @@
           <w:rFonts w:ascii="Calibri" w:eastAsia="Calibri" w:hAnsi="Calibri" w:cs="Calibri"/>
           <w:color w:val="000000"/>
         </w:rPr>
-        <w:t>BS Information Technology student building cross-platform mobile apps, web applications, and embedded/IoT systems using Flutter, Firebase, Kotlin, and C++. Comfortable across a broad stack (Java, Python, C/C++/C#, JavaScript, PHP, SQL, React, Laravel) with growing experience in machine learning (Scikit-learn, Pandas) and a Certified Data Science Associate credential.</w:t>
+        <w:t xml:space="preserve">BS Information Technology student with hands-on exposure to web and mobile development, data analysis, and embedded/IoT projects. Familiar with HTML, CSS, JavaScript, Python, SQL, and related tools through coursework and project work. Interested in UI/UX and continuing to build practical skills in web development and data analytics. Certified Data Science Associate.</w:t>
       </w:r>
     </w:p>
     <w:p>
@@ -183,7 +183,7 @@
           <w:sz w:val="22"/>
           <w:szCs w:val="22"/>
         </w:rPr>
-        <w:t>TECHNICAL SKILLS</w:t>
+        <w:t xml:space="preserve">TECHNICAL SKILLS</w:t>
       </w:r>
     </w:p>
     <w:p>
@@ -202,7 +202,7 @@
         <w:rPr>
           <w:rFonts w:ascii="Calibri" w:eastAsia="Calibri" w:hAnsi="Calibri" w:cs="Calibri"/>
         </w:rPr>
-        <w:t>Java, Python, C, C++, C#, Dart, PHP, JavaScript, Kotlin, SQL</w:t>
+        <w:t xml:space="preserve">Java, Python, C, C++, C#, Dart, PHP, JavaScript, Kotlin, SQL</w:t>
       </w:r>
     </w:p>
     <w:p>
@@ -221,21 +221,7 @@
         <w:rPr>
           <w:rFonts w:ascii="Calibri" w:eastAsia="Calibri" w:hAnsi="Calibri" w:cs="Calibri"/>
         </w:rPr>
-        <w:t>React,</w:t>
-      </w:r>
-      <w:r>
-        <w:rPr>
-          <w:rFonts w:ascii="Calibri" w:eastAsia="Calibri" w:hAnsi="Calibri" w:cs="Calibri"/>
-          <w:b/>
-          <w:bCs/>
-        </w:rPr>
-        <w:t xml:space="preserve"> </w:t>
-      </w:r>
-      <w:r>
-        <w:rPr>
-          <w:rFonts w:ascii="Calibri" w:eastAsia="Calibri" w:hAnsi="Calibri" w:cs="Calibri"/>
-        </w:rPr>
-        <w:t>Flutter, Laravel, Tailwind CSS, Firebase</w:t>
+        <w:t xml:space="preserve">React, Flutter, Laravel, Tailwind CSS, Firebase</w:t>
       </w:r>
     </w:p>
     <w:p>
@@ -257,7 +243,7 @@
         <w:rPr>
           <w:rFonts w:ascii="Calibri" w:eastAsia="Calibri" w:hAnsi="Calibri" w:cs="Calibri"/>
         </w:rPr>
-        <w:t>Android, HTML5, CSS3</w:t>
+        <w:t xml:space="preserve">HTML5, CSS3, Android</w:t>
       </w:r>
     </w:p>
     <w:p>
@@ -276,7 +262,7 @@
         <w:rPr>
           <w:rFonts w:ascii="Calibri" w:eastAsia="Calibri" w:hAnsi="Calibri" w:cs="Calibri"/>
         </w:rPr>
-        <w:t>Scikit-learn, Pandas</w:t>
+        <w:t xml:space="preserve">Scikit-learn, Pandas</w:t>
       </w:r>
     </w:p>
     <w:p>
@@ -295,7 +281,7 @@
         <w:rPr>
           <w:rFonts w:ascii="Calibri" w:eastAsia="Calibri" w:hAnsi="Calibri" w:cs="Calibri"/>
         </w:rPr>
-        <w:t>Firebase, Git, GitHub, Android Studio, VS Code, Arduino IDE</w:t>
+        <w:t xml:space="preserve">Git, GitHub, Android Studio, VS Code, Arduino IDE</w:t>
       </w:r>
     </w:p>
     <w:p>
@@ -449,34 +435,19 @@
         <w:rPr>
           <w:rFonts w:ascii="Calibri" w:eastAsia="Calibri" w:hAnsi="Calibri" w:cs="Calibri"/>
         </w:rPr>
-        <w:t>• Developed an Android app for managing class schedules and tracking assignments/exams by subject, with exact-alarm</w:t>
+        <w:t xml:space="preserve">• Developed an Android app to organize class schedules, assignments, and exams by subject, with exact-alarm notifications before classes.</w:t>
       </w:r>
     </w:p>
     <w:p>
       <w:pPr>
         <w:spacing w:after="40"/>
         <w:ind w:left="360" w:hanging="215"/>
-        <w:rPr>
-          <w:rFonts w:ascii="Calibri" w:eastAsia="Calibri" w:hAnsi="Calibri" w:cs="Calibri"/>
-        </w:rPr>
-      </w:pPr>
-      <w:r>
-        <w:rPr>
-          <w:rFonts w:ascii="Calibri" w:eastAsia="Calibri" w:hAnsi="Calibri" w:cs="Calibri"/>
-        </w:rPr>
-        <w:t>notifications before classes start.</w:t>
-      </w:r>
-    </w:p>
-    <w:p>
-      <w:pPr>
-        <w:spacing w:after="40"/>
-        <w:ind w:left="360" w:hanging="215"/>
-      </w:pPr>
-      <w:r>
-        <w:rPr>
-          <w:rFonts w:ascii="Calibri" w:eastAsia="Calibri" w:hAnsi="Calibri" w:cs="Calibri"/>
-        </w:rPr>
-        <w:t>• Built a tabbed dashboard giving students a quick overview of their schedule and pending tasks</w:t>
+      </w:pPr>
+      <w:r>
+        <w:rPr>
+          <w:rFonts w:ascii="Calibri" w:eastAsia="Calibri" w:hAnsi="Calibri" w:cs="Calibri"/>
+        </w:rPr>
+        <w:t xml:space="preserve">• Built a tabbed dashboard for an overview of class schedules and pending tasks.</w:t>
       </w:r>
     </w:p>
     <w:p>
@@ -572,7 +543,7 @@
           <w:sz w:val="22"/>
           <w:szCs w:val="22"/>
         </w:rPr>
-        <w:t>CERTIFICATIONS</w:t>
+        <w:t xml:space="preserve">CERTIFICATIONS</w:t>
       </w:r>
     </w:p>
     <w:p>
@@ -723,34 +694,20 @@
           <w:b/>
           <w:bCs/>
         </w:rPr>
-        <w:t xml:space="preserve">Python for Data Analysis | </w:t>
-      </w:r>
-      <w:r>
-        <w:rPr>
-          <w:rFonts w:ascii="Calibri" w:eastAsia="Calibri" w:hAnsi="Calibri" w:cs="Calibri"/>
-        </w:rPr>
-        <w:t>SimpliLearn</w:t>
+        <w:t xml:space="preserve">Intro to Machine Learning | </w:t>
+      </w:r>
+      <w:r>
+        <w:rPr>
+          <w:rFonts w:ascii="Calibri" w:eastAsia="Calibri" w:hAnsi="Calibri" w:cs="Calibri"/>
+        </w:rPr>
+        <w:t xml:space="preserve">Kaggle</w:t>
       </w:r>
       <w:r>
         <w:rPr>
           <w:rFonts w:ascii="Calibri" w:eastAsia="Calibri" w:hAnsi="Calibri" w:cs="Calibri"/>
         </w:rPr>
         <w:tab/>
-        <w:t>Issued Mar 2026</w:t>
-      </w:r>
-    </w:p>
-    <w:p>
-      <w:pPr>
-        <w:spacing w:after="100"/>
-      </w:pPr>
-      <w:r>
-        <w:rPr>
-          <w:rFonts w:ascii="Calibri" w:eastAsia="Calibri" w:hAnsi="Calibri" w:cs="Calibri"/>
-          <w:color w:val="444444"/>
-          <w:sz w:val="18"/>
-          <w:szCs w:val="18"/>
-        </w:rPr>
-        <w:t>Credential ID: 10014736</w:t>
+        <w:t xml:space="preserve">Issued Mar 2026</w:t>
       </w:r>
     </w:p>
     <w:p>
@@ -766,20 +723,20 @@
           <w:b/>
           <w:bCs/>
         </w:rPr>
-        <w:t xml:space="preserve">Data Analyst 101 | </w:t>
-      </w:r>
-      <w:r>
-        <w:rPr>
-          <w:rFonts w:ascii="Calibri" w:eastAsia="Calibri" w:hAnsi="Calibri" w:cs="Calibri"/>
-        </w:rPr>
-        <w:t>SimpliLearn</w:t>
+        <w:t xml:space="preserve">JavaScript for Beginners | </w:t>
+      </w:r>
+      <w:r>
+        <w:rPr>
+          <w:rFonts w:ascii="Calibri" w:eastAsia="Calibri" w:hAnsi="Calibri" w:cs="Calibri"/>
+        </w:rPr>
+        <w:t xml:space="preserve">Simplilearn</w:t>
       </w:r>
       <w:r>
         <w:rPr>
           <w:rFonts w:ascii="Calibri" w:eastAsia="Calibri" w:hAnsi="Calibri" w:cs="Calibri"/>
         </w:rPr>
         <w:tab/>
-        <w:t>Issued Nov 2025</w:t>
+        <w:t xml:space="preserve">Issued Mar 2025</w:t>
       </w:r>
     </w:p>
     <w:p>
@@ -793,93 +750,7 @@
           <w:sz w:val="18"/>
           <w:szCs w:val="18"/>
         </w:rPr>
-        <w:t>Credential ID: 9499335</w:t>
-      </w:r>
-    </w:p>
-    <w:p>
-      <w:pPr>
-        <w:tabs>
-          <w:tab w:val="right" w:pos="9360"/>
-        </w:tabs>
-        <w:spacing w:after="20"/>
-      </w:pPr>
-      <w:r>
-        <w:rPr>
-          <w:rFonts w:ascii="Calibri" w:eastAsia="Calibri" w:hAnsi="Calibri" w:cs="Calibri"/>
-          <w:b/>
-          <w:bCs/>
-        </w:rPr>
-        <w:t xml:space="preserve">Introduction to Cybersecurity | </w:t>
-      </w:r>
-      <w:r>
-        <w:rPr>
-          <w:rFonts w:ascii="Calibri" w:eastAsia="Calibri" w:hAnsi="Calibri" w:cs="Calibri"/>
-        </w:rPr>
-        <w:t>Cisco Networking Academy</w:t>
-      </w:r>
-      <w:r>
-        <w:rPr>
-          <w:rFonts w:ascii="Calibri" w:eastAsia="Calibri" w:hAnsi="Calibri" w:cs="Calibri"/>
-        </w:rPr>
-        <w:tab/>
-        <w:t>Issued May 2026</w:t>
-      </w:r>
-    </w:p>
-    <w:p>
-      <w:pPr>
-        <w:spacing w:after="100"/>
-      </w:pPr>
-      <w:r>
-        <w:rPr>
-          <w:rFonts w:ascii="Calibri" w:eastAsia="Calibri" w:hAnsi="Calibri" w:cs="Calibri"/>
-          <w:color w:val="444444"/>
-          <w:sz w:val="18"/>
-          <w:szCs w:val="18"/>
-        </w:rPr>
-        <w:t>Credential ID: ee675ba3-b10d-43fe-858b-a308302752f1</w:t>
-      </w:r>
-    </w:p>
-    <w:p>
-      <w:pPr>
-        <w:tabs>
-          <w:tab w:val="right" w:pos="9360"/>
-        </w:tabs>
-        <w:spacing w:after="20"/>
-      </w:pPr>
-      <w:r>
-        <w:rPr>
-          <w:rFonts w:ascii="Calibri" w:eastAsia="Calibri" w:hAnsi="Calibri" w:cs="Calibri"/>
-          <w:b/>
-          <w:bCs/>
-        </w:rPr>
-        <w:t xml:space="preserve">Introduction to Cyber Security | </w:t>
-      </w:r>
-      <w:r>
-        <w:rPr>
-          <w:rFonts w:ascii="Calibri" w:eastAsia="Calibri" w:hAnsi="Calibri" w:cs="Calibri"/>
-        </w:rPr>
-        <w:t>SimpliLearn</w:t>
-      </w:r>
-      <w:r>
-        <w:rPr>
-          <w:rFonts w:ascii="Calibri" w:eastAsia="Calibri" w:hAnsi="Calibri" w:cs="Calibri"/>
-        </w:rPr>
-        <w:tab/>
-        <w:t>Issued May 2026</w:t>
-      </w:r>
-    </w:p>
-    <w:p>
-      <w:pPr>
-        <w:spacing w:after="100"/>
-      </w:pPr>
-      <w:r>
-        <w:rPr>
-          <w:rFonts w:ascii="Calibri" w:eastAsia="Calibri" w:hAnsi="Calibri" w:cs="Calibri"/>
-          <w:color w:val="444444"/>
-          <w:sz w:val="18"/>
-          <w:szCs w:val="18"/>
-        </w:rPr>
-        <w:t>Credential ID: 10214918</w:t>
+        <w:t xml:space="preserve">Credential ID: 7983372</w:t>
       </w:r>
     </w:p>
     <w:sectPr>

</xml_diff>

<commit_message>
Update portfolio from latest resume and use transparent pixel logo
</commit_message>
<xml_diff>
--- a/assets/downloads/Angel-Delgado-Resume.docx
+++ b/assets/downloads/Angel-Delgado-Resume.docx
@@ -5,13 +5,17 @@
     <w:p>
       <w:pPr>
         <w:spacing w:after="40"/>
-      </w:pPr>
-      <w:r>
-        <w:rPr>
+        <w:rPr>
+          <w:rFonts w:ascii="Arial" w:hAnsi="Arial" w:cs="Arial"/>
+        </w:rPr>
+      </w:pPr>
+      <w:r>
+        <w:rPr>
+          <w:rFonts w:ascii="Arial" w:hAnsi="Arial" w:cs="Arial"/>
           <w:noProof/>
         </w:rPr>
         <w:drawing>
-          <wp:anchor distT="0" distB="0" distL="114300" distR="114300" simplePos="0" relativeHeight="251658240" behindDoc="0" locked="0" layoutInCell="1" allowOverlap="1" wp14:anchorId="2A8F023A" wp14:editId="517FE146">
+          <wp:anchor distT="0" distB="0" distL="114300" distR="114300" simplePos="0" relativeHeight="251658240" behindDoc="0" locked="0" layoutInCell="1" allowOverlap="1" wp14:anchorId="3C6FA851" wp14:editId="22990EB5">
             <wp:simplePos x="0" y="0"/>
             <wp:positionH relativeFrom="margin">
               <wp:align>right</wp:align>
@@ -56,7 +60,7 @@
       </w:r>
       <w:r>
         <w:rPr>
-          <w:rFonts w:ascii="Calibri" w:eastAsia="Calibri" w:hAnsi="Calibri" w:cs="Calibri"/>
+          <w:rFonts w:ascii="Arial" w:eastAsia="Calibri" w:hAnsi="Arial" w:cs="Arial"/>
           <w:b/>
           <w:bCs/>
           <w:color w:val="000000"/>
@@ -70,7 +74,7 @@
       <w:pPr>
         <w:spacing w:after="40"/>
         <w:rPr>
-          <w:rFonts w:ascii="Calibri" w:eastAsia="Calibri" w:hAnsi="Calibri" w:cs="Calibri"/>
+          <w:rFonts w:ascii="Arial" w:eastAsia="Calibri" w:hAnsi="Arial" w:cs="Arial"/>
           <w:color w:val="444444"/>
           <w:sz w:val="22"/>
           <w:szCs w:val="22"/>
@@ -78,24 +82,25 @@
       </w:pPr>
       <w:r>
         <w:rPr>
-          <w:rFonts w:ascii="Calibri" w:eastAsia="Calibri" w:hAnsi="Calibri" w:cs="Calibri"/>
+          <w:rFonts w:ascii="Arial" w:eastAsia="Calibri" w:hAnsi="Arial" w:cs="Arial"/>
           <w:color w:val="444444"/>
           <w:sz w:val="22"/>
           <w:szCs w:val="22"/>
         </w:rPr>
-        <w:t xml:space="preserve">Web Developer | UI/UX | Data Analytics</w:t>
+        <w:t>BSIT Student | Data Analytics | Web Development | UI/UX</w:t>
       </w:r>
     </w:p>
     <w:p>
       <w:pPr>
         <w:spacing w:after="40"/>
-      </w:pPr>
-      <w:r>
-        <w:rPr>
-          <w:rFonts w:ascii="Calibri" w:eastAsia="Calibri" w:hAnsi="Calibri" w:cs="Calibri"/>
+        <w:rPr>
+          <w:rFonts w:ascii="Arial" w:hAnsi="Arial" w:cs="Arial"/>
+        </w:rPr>
+      </w:pPr>
+      <w:r>
+        <w:rPr>
+          <w:rFonts w:ascii="Arial" w:eastAsia="Calibri" w:hAnsi="Arial" w:cs="Arial"/>
           <w:color w:val="444444"/>
-          <w:sz w:val="18"/>
-          <w:szCs w:val="18"/>
         </w:rPr>
         <w:t>Calapan City, Oriental Mindoro, Philippines | 0949 974 8597 | angeldelgado1816@gmail.com</w:t>
       </w:r>
@@ -103,24 +108,32 @@
     <w:p>
       <w:pPr>
         <w:spacing w:after="200"/>
+        <w:rPr>
+          <w:rFonts w:ascii="Arial" w:hAnsi="Arial" w:cs="Arial"/>
+        </w:rPr>
       </w:pPr>
       <w:hyperlink r:id="rId6" w:history="1">
         <w:r>
           <w:rPr>
             <w:rStyle w:val="Hyperlink"/>
-            <w:rFonts w:ascii="Calibri" w:eastAsia="Calibri" w:hAnsi="Calibri" w:cs="Calibri"/>
-            <w:sz w:val="18"/>
-            <w:szCs w:val="18"/>
+            <w:rFonts w:ascii="Arial" w:eastAsia="Calibri" w:hAnsi="Arial" w:cs="Arial"/>
           </w:rPr>
-          <w:t>linkedin.com/in/angel-delgado</w:t>
+          <w:t>linkedin.com/in/angel-</w:t>
         </w:r>
+        <w:proofErr w:type="spellStart"/>
+        <w:r>
+          <w:rPr>
+            <w:rStyle w:val="Hyperlink"/>
+            <w:rFonts w:ascii="Arial" w:eastAsia="Calibri" w:hAnsi="Arial" w:cs="Arial"/>
+          </w:rPr>
+          <w:t>delgado</w:t>
+        </w:r>
+        <w:proofErr w:type="spellEnd"/>
       </w:hyperlink>
       <w:r>
         <w:rPr>
-          <w:rFonts w:ascii="Calibri" w:eastAsia="Calibri" w:hAnsi="Calibri" w:cs="Calibri"/>
+          <w:rFonts w:ascii="Arial" w:eastAsia="Calibri" w:hAnsi="Arial" w:cs="Arial"/>
           <w:color w:val="444444"/>
-          <w:sz w:val="18"/>
-          <w:szCs w:val="18"/>
         </w:rPr>
         <w:t xml:space="preserve"> | </w:t>
       </w:r>
@@ -128,9 +141,7 @@
         <w:r>
           <w:rPr>
             <w:rStyle w:val="Hyperlink"/>
-            <w:rFonts w:ascii="Calibri" w:eastAsia="Calibri" w:hAnsi="Calibri" w:cs="Calibri"/>
-            <w:sz w:val="18"/>
-            <w:szCs w:val="18"/>
+            <w:rFonts w:ascii="Arial" w:eastAsia="Calibri" w:hAnsi="Arial" w:cs="Arial"/>
           </w:rPr>
           <w:t>github.com/Delgado010604</w:t>
         </w:r>
@@ -142,10 +153,13 @@
           <w:bottom w:val="single" w:sz="6" w:space="2" w:color="000000"/>
         </w:pBdr>
         <w:spacing w:before="200" w:after="80"/>
-      </w:pPr>
-      <w:r>
-        <w:rPr>
-          <w:rFonts w:ascii="Calibri" w:eastAsia="Calibri" w:hAnsi="Calibri" w:cs="Calibri"/>
+        <w:rPr>
+          <w:rFonts w:ascii="Arial" w:hAnsi="Arial" w:cs="Arial"/>
+        </w:rPr>
+      </w:pPr>
+      <w:r>
+        <w:rPr>
+          <w:rFonts w:ascii="Arial" w:eastAsia="Calibri" w:hAnsi="Arial" w:cs="Arial"/>
           <w:b/>
           <w:bCs/>
           <w:color w:val="000000"/>
@@ -158,13 +172,16 @@
     <w:p>
       <w:pPr>
         <w:spacing w:after="160"/>
-      </w:pPr>
-      <w:r>
-        <w:rPr>
-          <w:rFonts w:ascii="Calibri" w:eastAsia="Calibri" w:hAnsi="Calibri" w:cs="Calibri"/>
+        <w:rPr>
+          <w:rFonts w:ascii="Arial" w:hAnsi="Arial" w:cs="Arial"/>
+        </w:rPr>
+      </w:pPr>
+      <w:r>
+        <w:rPr>
+          <w:rFonts w:ascii="Arial" w:eastAsia="Calibri" w:hAnsi="Arial" w:cs="Arial"/>
           <w:color w:val="000000"/>
         </w:rPr>
-        <w:t xml:space="preserve">BS Information Technology student with hands-on exposure to web and mobile development, data analysis, and embedded/IoT projects. Familiar with HTML, CSS, JavaScript, Python, SQL, and related tools through coursework and project work. Interested in UI/UX and continuing to build practical skills in web development and data analytics. Certified Data Science Associate.</w:t>
+        <w:t>BS Information Technology student and Certified Data Science Associate with coursework and training in Python, SQL, and data analysis. Contributed coding and UI improvements to team-built Flutter and Kotlin applications, and coding and debugging to an ESP32 robotics project. Interests include data analytics, web development, and UI/UX.</w:t>
       </w:r>
     </w:p>
     <w:p>
@@ -173,26 +190,32 @@
           <w:bottom w:val="single" w:sz="6" w:space="2" w:color="000000"/>
         </w:pBdr>
         <w:spacing w:before="200" w:after="80"/>
-      </w:pPr>
-      <w:r>
-        <w:rPr>
-          <w:rFonts w:ascii="Calibri" w:eastAsia="Calibri" w:hAnsi="Calibri" w:cs="Calibri"/>
+        <w:rPr>
+          <w:rFonts w:ascii="Arial" w:hAnsi="Arial" w:cs="Arial"/>
+        </w:rPr>
+      </w:pPr>
+      <w:r>
+        <w:rPr>
+          <w:rFonts w:ascii="Arial" w:eastAsia="Calibri" w:hAnsi="Arial" w:cs="Arial"/>
           <w:b/>
           <w:bCs/>
           <w:color w:val="000000"/>
           <w:sz w:val="22"/>
           <w:szCs w:val="22"/>
         </w:rPr>
-        <w:t xml:space="preserve">TECHNICAL SKILLS</w:t>
+        <w:t>TECHNICAL SKILLS</w:t>
       </w:r>
     </w:p>
     <w:p>
       <w:pPr>
         <w:spacing w:after="60"/>
-      </w:pPr>
-      <w:r>
-        <w:rPr>
-          <w:rFonts w:ascii="Calibri" w:eastAsia="Calibri" w:hAnsi="Calibri" w:cs="Calibri"/>
+        <w:rPr>
+          <w:rFonts w:ascii="Arial" w:hAnsi="Arial" w:cs="Arial"/>
+        </w:rPr>
+      </w:pPr>
+      <w:r>
+        <w:rPr>
+          <w:rFonts w:ascii="Arial" w:eastAsia="Calibri" w:hAnsi="Arial" w:cs="Arial"/>
           <w:b/>
           <w:bCs/>
         </w:rPr>
@@ -200,18 +223,21 @@
       </w:r>
       <w:r>
         <w:rPr>
-          <w:rFonts w:ascii="Calibri" w:eastAsia="Calibri" w:hAnsi="Calibri" w:cs="Calibri"/>
-        </w:rPr>
-        <w:t xml:space="preserve">Java, Python, C, C++, C#, Dart, PHP, JavaScript, Kotlin, SQL</w:t>
+          <w:rFonts w:ascii="Arial" w:eastAsia="Calibri" w:hAnsi="Arial" w:cs="Arial"/>
+        </w:rPr>
+        <w:t>Java, Python, C, C++, C#, Dart, PHP, JavaScript, Kotlin, SQL</w:t>
       </w:r>
     </w:p>
     <w:p>
       <w:pPr>
         <w:spacing w:after="60"/>
-      </w:pPr>
-      <w:r>
-        <w:rPr>
-          <w:rFonts w:ascii="Calibri" w:eastAsia="Calibri" w:hAnsi="Calibri" w:cs="Calibri"/>
+        <w:rPr>
+          <w:rFonts w:ascii="Arial" w:hAnsi="Arial" w:cs="Arial"/>
+        </w:rPr>
+      </w:pPr>
+      <w:r>
+        <w:rPr>
+          <w:rFonts w:ascii="Arial" w:eastAsia="Calibri" w:hAnsi="Arial" w:cs="Arial"/>
           <w:b/>
           <w:bCs/>
         </w:rPr>
@@ -219,21 +245,21 @@
       </w:r>
       <w:r>
         <w:rPr>
-          <w:rFonts w:ascii="Calibri" w:eastAsia="Calibri" w:hAnsi="Calibri" w:cs="Calibri"/>
-        </w:rPr>
-        <w:t xml:space="preserve">React, Flutter, Laravel, Tailwind CSS, Firebase</w:t>
+          <w:rFonts w:ascii="Arial" w:hAnsi="Arial" w:cs="Arial"/>
+        </w:rPr>
+        <w:t>React, Flutter, Laravel, Tailwind CSS</w:t>
       </w:r>
     </w:p>
     <w:p>
       <w:pPr>
         <w:spacing w:after="60"/>
         <w:rPr>
-          <w:rFonts w:ascii="Calibri" w:eastAsia="Calibri" w:hAnsi="Calibri" w:cs="Calibri"/>
-        </w:rPr>
-      </w:pPr>
-      <w:r>
-        <w:rPr>
-          <w:rFonts w:ascii="Calibri" w:eastAsia="Calibri" w:hAnsi="Calibri" w:cs="Calibri"/>
+          <w:rFonts w:ascii="Arial" w:eastAsia="Calibri" w:hAnsi="Arial" w:cs="Arial"/>
+        </w:rPr>
+      </w:pPr>
+      <w:r>
+        <w:rPr>
+          <w:rFonts w:ascii="Arial" w:eastAsia="Calibri" w:hAnsi="Arial" w:cs="Arial"/>
           <w:b/>
           <w:bCs/>
         </w:rPr>
@@ -241,37 +267,43 @@
       </w:r>
       <w:r>
         <w:rPr>
-          <w:rFonts w:ascii="Calibri" w:eastAsia="Calibri" w:hAnsi="Calibri" w:cs="Calibri"/>
-        </w:rPr>
-        <w:t xml:space="preserve">HTML5, CSS3, Android</w:t>
+          <w:rFonts w:ascii="Arial" w:eastAsia="Calibri" w:hAnsi="Arial" w:cs="Arial"/>
+        </w:rPr>
+        <w:t>HTML5, CSS3, Android</w:t>
       </w:r>
     </w:p>
     <w:p>
       <w:pPr>
         <w:spacing w:after="60"/>
-      </w:pPr>
-      <w:r>
-        <w:rPr>
-          <w:rFonts w:ascii="Calibri" w:eastAsia="Calibri" w:hAnsi="Calibri" w:cs="Calibri"/>
+        <w:rPr>
+          <w:rFonts w:ascii="Arial" w:hAnsi="Arial" w:cs="Arial"/>
+        </w:rPr>
+      </w:pPr>
+      <w:r>
+        <w:rPr>
+          <w:rFonts w:ascii="Arial" w:eastAsia="Calibri" w:hAnsi="Arial" w:cs="Arial"/>
           <w:b/>
           <w:bCs/>
         </w:rPr>
-        <w:t xml:space="preserve">Machine Learning: </w:t>
-      </w:r>
-      <w:r>
-        <w:rPr>
-          <w:rFonts w:ascii="Calibri" w:eastAsia="Calibri" w:hAnsi="Calibri" w:cs="Calibri"/>
-        </w:rPr>
-        <w:t xml:space="preserve">Scikit-learn, Pandas</w:t>
+        <w:t xml:space="preserve">Data Analysis &amp; Machine Learning: </w:t>
+      </w:r>
+      <w:r>
+        <w:rPr>
+          <w:rFonts w:ascii="Arial" w:hAnsi="Arial" w:cs="Arial"/>
+        </w:rPr>
+        <w:t>Pandas, Scikit-learn</w:t>
       </w:r>
     </w:p>
     <w:p>
       <w:pPr>
         <w:spacing w:after="60"/>
-      </w:pPr>
-      <w:r>
-        <w:rPr>
-          <w:rFonts w:ascii="Calibri" w:eastAsia="Calibri" w:hAnsi="Calibri" w:cs="Calibri"/>
+        <w:rPr>
+          <w:rFonts w:ascii="Arial" w:hAnsi="Arial" w:cs="Arial"/>
+        </w:rPr>
+      </w:pPr>
+      <w:r>
+        <w:rPr>
+          <w:rFonts w:ascii="Arial" w:eastAsia="Calibri" w:hAnsi="Arial" w:cs="Arial"/>
           <w:b/>
           <w:bCs/>
         </w:rPr>
@@ -279,9 +311,9 @@
       </w:r>
       <w:r>
         <w:rPr>
-          <w:rFonts w:ascii="Calibri" w:eastAsia="Calibri" w:hAnsi="Calibri" w:cs="Calibri"/>
-        </w:rPr>
-        <w:t xml:space="preserve">Git, GitHub, Android Studio, VS Code, Arduino IDE</w:t>
+          <w:rFonts w:ascii="Arial" w:hAnsi="Arial" w:cs="Arial"/>
+        </w:rPr>
+        <w:t>Firebase, Git, GitHub, Android Studio, VS Code, Arduino IDE</w:t>
       </w:r>
     </w:p>
     <w:p>
@@ -290,10 +322,13 @@
           <w:bottom w:val="single" w:sz="6" w:space="2" w:color="000000"/>
         </w:pBdr>
         <w:spacing w:before="200" w:after="80"/>
-      </w:pPr>
-      <w:r>
-        <w:rPr>
-          <w:rFonts w:ascii="Calibri" w:eastAsia="Calibri" w:hAnsi="Calibri" w:cs="Calibri"/>
+        <w:rPr>
+          <w:rFonts w:ascii="Arial" w:hAnsi="Arial" w:cs="Arial"/>
+        </w:rPr>
+      </w:pPr>
+      <w:r>
+        <w:rPr>
+          <w:rFonts w:ascii="Arial" w:eastAsia="Calibri" w:hAnsi="Arial" w:cs="Arial"/>
           <w:b/>
           <w:bCs/>
           <w:color w:val="000000"/>
@@ -305,149 +340,211 @@
     </w:p>
     <w:p>
       <w:pPr>
-        <w:spacing w:before="120" w:after="20"/>
-        <w:rPr>
+        <w:keepNext/>
+        <w:tabs>
+          <w:tab w:pos="10440" w:val="right"/>
+        </w:tabs>
+        <w:spacing w:before="120" w:after="20" w:line="240" w:lineRule="auto"/>
+      </w:pPr>
+      <w:r>
+        <w:rPr>
+          <w:rFonts w:ascii="Arial" w:hAnsi="Arial"/>
           <w:b/>
-          <w:bCs/>
-        </w:rPr>
-      </w:pPr>
-      <w:r>
-        <w:rPr>
-          <w:rFonts w:ascii="Calibri" w:eastAsia="Calibri" w:hAnsi="Calibri" w:cs="Calibri"/>
+          <w:sz w:val="20"/>
+        </w:rPr>
+        <w:t>Himpawid — Air Quality Monitoring App</w:t>
+      </w:r>
+      <w:r>
+        <w:rPr>
+          <w:rFonts w:ascii="Arial" w:hAnsi="Arial"/>
+          <w:sz w:val="20"/>
+        </w:rPr>
+        <w:tab/>
+        <w:t>December 2025</w:t>
+      </w:r>
+    </w:p>
+    <w:p>
+      <w:pPr>
+        <w:keepNext/>
+        <w:spacing w:after="20" w:line="240" w:lineRule="auto"/>
+      </w:pPr>
+      <w:r>
+        <w:rPr>
+          <w:rFonts w:ascii="Arial" w:hAnsi="Arial"/>
+          <w:sz w:val="20"/>
+        </w:rPr>
+        <w:t>Flutter, Firebase</w:t>
+      </w:r>
+    </w:p>
+    <w:p>
+      <w:pPr>
+        <w:pStyle w:val="ListParagraph"/>
+        <w:numPr>
+          <w:ilvl w:val="0"/>
+          <w:numId w:val="8"/>
+        </w:numPr>
+        <w:spacing w:after="40"/>
+        <w:rPr>
+          <w:rFonts w:ascii="Arial" w:eastAsia="Calibri" w:hAnsi="Arial" w:cs="Arial"/>
+        </w:rPr>
+      </w:pPr>
+      <w:r>
+        <w:rPr>
+          <w:rFonts w:ascii="Arial" w:eastAsia="Calibri" w:hAnsi="Arial" w:cs="Arial"/>
+        </w:rPr>
+        <w:t>Collaborated on a Flutter and Firebase app displaying location-based air quality, pollutant readings, and a color-coded map using OpenWeatherMap data.</w:t>
+      </w:r>
+    </w:p>
+    <w:p>
+      <w:pPr>
+        <w:pStyle w:val="ListParagraph"/>
+        <w:numPr>
+          <w:ilvl w:val="0"/>
+          <w:numId w:val="8"/>
+        </w:numPr>
+        <w:spacing w:after="40"/>
+        <w:rPr>
+          <w:rFonts w:ascii="Arial" w:hAnsi="Arial" w:cs="Arial"/>
+        </w:rPr>
+      </w:pPr>
+      <w:r>
+        <w:rPr>
+          <w:rFonts w:ascii="Arial" w:eastAsia="Calibri" w:hAnsi="Arial" w:cs="Arial"/>
+        </w:rPr>
+        <w:t>Contributed coding and UI fixes as part of a team sharing development responsibilities across the app.</w:t>
+      </w:r>
+    </w:p>
+    <w:p>
+      <w:pPr>
+        <w:keepNext/>
+        <w:tabs>
+          <w:tab w:pos="10440" w:val="right"/>
+        </w:tabs>
+        <w:spacing w:before="120" w:after="20" w:line="240" w:lineRule="auto"/>
+      </w:pPr>
+      <w:r>
+        <w:rPr>
+          <w:rFonts w:ascii="Arial" w:hAnsi="Arial"/>
           <w:b/>
-          <w:bCs/>
-        </w:rPr>
-        <w:t xml:space="preserve">Himpawid — Real-Time Air Quality Monitoring App </w:t>
-      </w:r>
-      <w:r>
-        <w:rPr>
-          <w:rFonts w:ascii="Calibri" w:eastAsia="Calibri" w:hAnsi="Calibri" w:cs="Calibri"/>
+          <w:sz w:val="20"/>
+        </w:rPr>
+        <w:t>TrackGuard — ESP32-CAM Autonomous Robot Car</w:t>
+      </w:r>
+      <w:r>
+        <w:rPr>
+          <w:rFonts w:ascii="Arial" w:hAnsi="Arial"/>
+          <w:sz w:val="20"/>
+        </w:rPr>
+        <w:tab/>
+        <w:t>March 2026</w:t>
+      </w:r>
+    </w:p>
+    <w:p>
+      <w:pPr>
+        <w:keepNext/>
+        <w:spacing w:after="20" w:line="240" w:lineRule="auto"/>
+      </w:pPr>
+      <w:r>
+        <w:rPr>
+          <w:rFonts w:ascii="Arial" w:hAnsi="Arial"/>
+          <w:sz w:val="20"/>
+        </w:rPr>
+        <w:t>C++, ESP32</w:t>
+      </w:r>
+    </w:p>
+    <w:p>
+      <w:pPr>
+        <w:pStyle w:val="ListParagraph"/>
+        <w:numPr>
+          <w:ilvl w:val="0"/>
+          <w:numId w:val="7"/>
+        </w:numPr>
+        <w:spacing w:after="40"/>
+        <w:rPr>
+          <w:rFonts w:ascii="Arial" w:eastAsia="Calibri" w:hAnsi="Arial" w:cs="Arial"/>
+        </w:rPr>
+      </w:pPr>
+      <w:r>
+        <w:rPr>
+          <w:rFonts w:ascii="Arial" w:eastAsia="Calibri" w:hAnsi="Arial" w:cs="Arial"/>
+        </w:rPr>
+        <w:t>Contributed coding and debugging to a team-built ESP32-CAM robot car with infrared line-following, ultrasonic obstacle avoidance, live video streaming, and manual IR remote override.</w:t>
+      </w:r>
+    </w:p>
+    <w:p>
+      <w:pPr>
+        <w:keepNext/>
+        <w:tabs>
+          <w:tab w:pos="10440" w:val="right"/>
+        </w:tabs>
+        <w:spacing w:before="120" w:after="20" w:line="240" w:lineRule="auto"/>
+      </w:pPr>
+      <w:r>
+        <w:rPr>
+          <w:rFonts w:ascii="Arial" w:hAnsi="Arial"/>
           <w:b/>
-          <w:bCs/>
-          <w:color w:val="444444"/>
-        </w:rPr>
-        <w:t>|  Flutter, Firebase</w:t>
-      </w:r>
-    </w:p>
-    <w:p>
-      <w:pPr>
+          <w:sz w:val="20"/>
+        </w:rPr>
+        <w:t>SmartClassSchedule — Android Class Scheduler App</w:t>
+      </w:r>
+      <w:r>
+        <w:rPr>
+          <w:rFonts w:ascii="Arial" w:hAnsi="Arial"/>
+          <w:sz w:val="20"/>
+        </w:rPr>
+        <w:tab/>
+        <w:t>December 2025</w:t>
+      </w:r>
+    </w:p>
+    <w:p>
+      <w:pPr>
+        <w:keepNext/>
+        <w:spacing w:after="20" w:line="240" w:lineRule="auto"/>
+      </w:pPr>
+      <w:r>
+        <w:rPr>
+          <w:rFonts w:ascii="Arial" w:hAnsi="Arial"/>
+          <w:sz w:val="20"/>
+        </w:rPr>
+        <w:t>Kotlin</w:t>
+      </w:r>
+    </w:p>
+    <w:p>
+      <w:pPr>
+        <w:pStyle w:val="ListParagraph"/>
+        <w:numPr>
+          <w:ilvl w:val="0"/>
+          <w:numId w:val="6"/>
+        </w:numPr>
         <w:spacing w:after="40"/>
-        <w:ind w:left="360" w:hanging="215"/>
-        <w:rPr>
-          <w:rFonts w:ascii="Calibri" w:eastAsia="Calibri" w:hAnsi="Calibri" w:cs="Calibri"/>
-        </w:rPr>
-      </w:pPr>
-      <w:r>
-        <w:rPr>
-          <w:rFonts w:ascii="Calibri" w:eastAsia="Calibri" w:hAnsi="Calibri" w:cs="Calibri"/>
-        </w:rPr>
-        <w:t>• Developed a cross-platform mobile app showing live and forecast Air Quality Index, a color-coded pollution map, and health guidance.</w:t>
-      </w:r>
-    </w:p>
-    <w:p>
-      <w:pPr>
+        <w:rPr>
+          <w:rFonts w:ascii="Arial" w:eastAsia="Calibri" w:hAnsi="Arial" w:cs="Arial"/>
+        </w:rPr>
+      </w:pPr>
+      <w:r>
+        <w:rPr>
+          <w:rFonts w:ascii="Arial" w:eastAsia="Calibri" w:hAnsi="Arial" w:cs="Arial"/>
+        </w:rPr>
+        <w:t>Collaborated on a Kotlin Android app for managing class schedules, assignments, and exams by subject, with scheduled class and task reminders.</w:t>
+      </w:r>
+    </w:p>
+    <w:p>
+      <w:pPr>
+        <w:pStyle w:val="ListParagraph"/>
+        <w:numPr>
+          <w:ilvl w:val="0"/>
+          <w:numId w:val="6"/>
+        </w:numPr>
         <w:spacing w:after="40"/>
-        <w:ind w:left="360" w:hanging="215"/>
-      </w:pPr>
-      <w:r>
-        <w:rPr>
-          <w:rFonts w:ascii="Calibri" w:eastAsia="Calibri" w:hAnsi="Calibri" w:cs="Calibri"/>
-        </w:rPr>
-        <w:t>• Built the entire data pipeline on live, real API sources with no mock or placeholder data.</w:t>
-      </w:r>
-    </w:p>
-    <w:p>
-      <w:pPr>
-        <w:spacing w:before="120" w:after="20"/>
-        <w:rPr>
-          <w:b/>
-          <w:bCs/>
-        </w:rPr>
-      </w:pPr>
-      <w:r>
-        <w:rPr>
-          <w:rFonts w:ascii="Calibri" w:eastAsia="Calibri" w:hAnsi="Calibri" w:cs="Calibri"/>
-          <w:b/>
-          <w:bCs/>
-        </w:rPr>
-        <w:t xml:space="preserve">TrackGuard — ESP32-CAM Autonomous Robot Car </w:t>
-      </w:r>
-      <w:r>
-        <w:rPr>
-          <w:rFonts w:ascii="Calibri" w:eastAsia="Calibri" w:hAnsi="Calibri" w:cs="Calibri"/>
-          <w:b/>
-          <w:bCs/>
-          <w:color w:val="444444"/>
-        </w:rPr>
-        <w:t>|  C++, ESP32</w:t>
-      </w:r>
-    </w:p>
-    <w:p>
-      <w:pPr>
-        <w:spacing w:after="40"/>
-        <w:ind w:left="360" w:hanging="215"/>
-        <w:rPr>
-          <w:rFonts w:ascii="Calibri" w:eastAsia="Calibri" w:hAnsi="Calibri" w:cs="Calibri"/>
-        </w:rPr>
-      </w:pPr>
-      <w:r>
-        <w:rPr>
-          <w:rFonts w:ascii="Calibri" w:eastAsia="Calibri" w:hAnsi="Calibri" w:cs="Calibri"/>
-        </w:rPr>
-        <w:t>• Designed an autonomous robot car with infrared line-following, ultrasonic obstacle avoidance, live video streaming, and manual IR remote override.</w:t>
-      </w:r>
-    </w:p>
-    <w:p>
-      <w:pPr>
-        <w:spacing w:before="120" w:after="20"/>
-        <w:rPr>
-          <w:b/>
-          <w:bCs/>
-        </w:rPr>
-      </w:pPr>
-      <w:r>
-        <w:rPr>
-          <w:rFonts w:ascii="Calibri" w:eastAsia="Calibri" w:hAnsi="Calibri" w:cs="Calibri"/>
-          <w:b/>
-          <w:bCs/>
-        </w:rPr>
-        <w:t xml:space="preserve">SmartClassSchedule — Android Class Scheduler App </w:t>
-      </w:r>
-      <w:r>
-        <w:rPr>
-          <w:rFonts w:ascii="Calibri" w:eastAsia="Calibri" w:hAnsi="Calibri" w:cs="Calibri"/>
-          <w:b/>
-          <w:bCs/>
-          <w:color w:val="444444"/>
-        </w:rPr>
-        <w:t>|  Kotlin</w:t>
-      </w:r>
-    </w:p>
-    <w:p>
-      <w:pPr>
-        <w:spacing w:after="40"/>
-        <w:ind w:left="360" w:hanging="215"/>
-        <w:rPr>
-          <w:rFonts w:ascii="Calibri" w:eastAsia="Calibri" w:hAnsi="Calibri" w:cs="Calibri"/>
-        </w:rPr>
-      </w:pPr>
-      <w:r>
-        <w:rPr>
-          <w:rFonts w:ascii="Calibri" w:eastAsia="Calibri" w:hAnsi="Calibri" w:cs="Calibri"/>
-        </w:rPr>
-        <w:t xml:space="preserve">• Developed an Android app to organize class schedules, assignments, and exams by subject, with exact-alarm notifications before classes.</w:t>
-      </w:r>
-    </w:p>
-    <w:p>
-      <w:pPr>
-        <w:spacing w:after="40"/>
-        <w:ind w:left="360" w:hanging="215"/>
-      </w:pPr>
-      <w:r>
-        <w:rPr>
-          <w:rFonts w:ascii="Calibri" w:eastAsia="Calibri" w:hAnsi="Calibri" w:cs="Calibri"/>
-        </w:rPr>
-        <w:t xml:space="preserve">• Built a tabbed dashboard for an overview of class schedules and pending tasks.</w:t>
+        <w:rPr>
+          <w:rFonts w:ascii="Arial" w:hAnsi="Arial" w:cs="Arial"/>
+        </w:rPr>
+      </w:pPr>
+      <w:r>
+        <w:rPr>
+          <w:rFonts w:ascii="Arial" w:eastAsia="Calibri" w:hAnsi="Arial" w:cs="Arial"/>
+        </w:rPr>
+        <w:t>Contributed UI development and coding, including a weekday-tabbed dashboard displaying class schedules and upcoming tasks.</w:t>
       </w:r>
     </w:p>
     <w:p>
@@ -456,10 +553,13 @@
           <w:bottom w:val="single" w:sz="6" w:space="2" w:color="000000"/>
         </w:pBdr>
         <w:spacing w:before="200" w:after="80"/>
-      </w:pPr>
-      <w:r>
-        <w:rPr>
-          <w:rFonts w:ascii="Calibri" w:eastAsia="Calibri" w:hAnsi="Calibri" w:cs="Calibri"/>
+        <w:rPr>
+          <w:rFonts w:ascii="Arial" w:hAnsi="Arial" w:cs="Arial"/>
+        </w:rPr>
+      </w:pPr>
+      <w:r>
+        <w:rPr>
+          <w:rFonts w:ascii="Arial" w:eastAsia="Calibri" w:hAnsi="Arial" w:cs="Arial"/>
           <w:b/>
           <w:bCs/>
           <w:color w:val="000000"/>
@@ -471,28 +571,24 @@
     </w:p>
     <w:p>
       <w:pPr>
+        <w:keepNext/>
         <w:tabs>
-          <w:tab w:val="right" w:pos="9360"/>
+          <w:tab w:pos="10440" w:val="right"/>
         </w:tabs>
-        <w:spacing w:after="100"/>
-      </w:pPr>
-      <w:r>
-        <w:rPr>
-          <w:rFonts w:ascii="Calibri" w:eastAsia="Calibri" w:hAnsi="Calibri" w:cs="Calibri"/>
+        <w:spacing w:before="120" w:after="20" w:line="240" w:lineRule="auto"/>
+      </w:pPr>
+      <w:r>
+        <w:rPr>
+          <w:rFonts w:ascii="Arial" w:hAnsi="Arial"/>
           <w:b/>
-          <w:bCs/>
-        </w:rPr>
-        <w:t xml:space="preserve">BS in Information Technology | </w:t>
-      </w:r>
-      <w:r>
-        <w:rPr>
-          <w:rFonts w:ascii="Calibri" w:eastAsia="Calibri" w:hAnsi="Calibri" w:cs="Calibri"/>
-        </w:rPr>
-        <w:t>Divine Word College of Calapan, Calapan, Oriental Mindoro</w:t>
-      </w:r>
-      <w:r>
-        <w:rPr>
-          <w:rFonts w:ascii="Calibri" w:eastAsia="Calibri" w:hAnsi="Calibri" w:cs="Calibri"/>
+          <w:sz w:val="20"/>
+        </w:rPr>
+        <w:t>BS in Information Technology</w:t>
+      </w:r>
+      <w:r>
+        <w:rPr>
+          <w:rFonts w:ascii="Arial" w:hAnsi="Arial"/>
+          <w:sz w:val="20"/>
         </w:rPr>
         <w:tab/>
         <w:t>Expected 2027</w:t>
@@ -500,31 +596,53 @@
     </w:p>
     <w:p>
       <w:pPr>
+        <w:keepNext/>
+        <w:spacing w:after="20" w:line="240" w:lineRule="auto"/>
+      </w:pPr>
+      <w:r>
+        <w:rPr>
+          <w:rFonts w:ascii="Arial" w:hAnsi="Arial"/>
+          <w:sz w:val="20"/>
+        </w:rPr>
+        <w:t>Divine Word College of Calapan, Calapan, Oriental Mindoro</w:t>
+      </w:r>
+    </w:p>
+    <w:p>
+      <w:pPr>
+        <w:keepNext/>
         <w:tabs>
-          <w:tab w:val="right" w:pos="9360"/>
+          <w:tab w:pos="10440" w:val="right"/>
         </w:tabs>
-        <w:spacing w:after="100"/>
-      </w:pPr>
-      <w:r>
-        <w:rPr>
-          <w:rFonts w:ascii="Calibri" w:eastAsia="Calibri" w:hAnsi="Calibri" w:cs="Calibri"/>
+        <w:spacing w:before="120" w:after="20" w:line="240" w:lineRule="auto"/>
+      </w:pPr>
+      <w:r>
+        <w:rPr>
+          <w:rFonts w:ascii="Arial" w:hAnsi="Arial"/>
           <w:b/>
-          <w:bCs/>
-        </w:rPr>
-        <w:t xml:space="preserve">Senior High School — STEM | </w:t>
-      </w:r>
-      <w:r>
-        <w:rPr>
-          <w:rFonts w:ascii="Calibri" w:eastAsia="Calibri" w:hAnsi="Calibri" w:cs="Calibri"/>
-        </w:rPr>
-        <w:t>Divine Word College of Calapan, Calapan, Oriental Mindoro</w:t>
-      </w:r>
-      <w:r>
-        <w:rPr>
-          <w:rFonts w:ascii="Calibri" w:eastAsia="Calibri" w:hAnsi="Calibri" w:cs="Calibri"/>
+          <w:sz w:val="20"/>
+        </w:rPr>
+        <w:t>Senior High School — STEM</w:t>
+      </w:r>
+      <w:r>
+        <w:rPr>
+          <w:rFonts w:ascii="Arial" w:hAnsi="Arial"/>
+          <w:sz w:val="20"/>
         </w:rPr>
         <w:tab/>
         <w:t>2022</w:t>
+      </w:r>
+    </w:p>
+    <w:p>
+      <w:pPr>
+        <w:keepNext/>
+        <w:spacing w:after="20" w:line="240" w:lineRule="auto"/>
+      </w:pPr>
+      <w:r>
+        <w:rPr>
+          <w:rFonts w:ascii="Arial" w:hAnsi="Arial"/>
+          <w:sz w:val="20"/>
+        </w:rPr>
+        <w:t>Divine Word College of Calapan, Calapan, Oriental Mindoro</w:t>
       </w:r>
     </w:p>
     <w:p>
@@ -533,225 +651,191 @@
           <w:bottom w:val="single" w:sz="6" w:space="2" w:color="000000"/>
         </w:pBdr>
         <w:spacing w:before="200" w:after="80"/>
-      </w:pPr>
-      <w:r>
-        <w:rPr>
-          <w:rFonts w:ascii="Calibri" w:eastAsia="Calibri" w:hAnsi="Calibri" w:cs="Calibri"/>
+        <w:rPr>
+          <w:rFonts w:ascii="Arial" w:hAnsi="Arial" w:cs="Arial"/>
+        </w:rPr>
+      </w:pPr>
+      <w:r>
+        <w:rPr>
+          <w:rFonts w:ascii="Arial" w:eastAsia="Calibri" w:hAnsi="Arial" w:cs="Arial"/>
           <w:b/>
           <w:bCs/>
           <w:color w:val="000000"/>
           <w:sz w:val="22"/>
           <w:szCs w:val="22"/>
         </w:rPr>
-        <w:t xml:space="preserve">CERTIFICATIONS</w:t>
-      </w:r>
-    </w:p>
-    <w:p>
-      <w:pPr>
-        <w:tabs>
-          <w:tab w:val="right" w:pos="9360"/>
-        </w:tabs>
-        <w:spacing w:after="20"/>
-      </w:pPr>
-      <w:r>
-        <w:rPr>
-          <w:rFonts w:ascii="Calibri" w:eastAsia="Calibri" w:hAnsi="Calibri" w:cs="Calibri"/>
+        <w:t>CERTIFICATIONS</w:t>
+      </w:r>
+      <w:r>
+        <w:rPr>
+          <w:rFonts w:ascii="Arial" w:eastAsia="Calibri" w:hAnsi="Arial" w:cs="Arial"/>
           <w:b/>
           <w:bCs/>
-        </w:rPr>
-        <w:t xml:space="preserve">Certified Data Science Associate (CDSA) | </w:t>
-      </w:r>
-      <w:r>
-        <w:rPr>
-          <w:rFonts w:ascii="Calibri" w:eastAsia="Calibri" w:hAnsi="Calibri" w:cs="Calibri"/>
+          <w:color w:val="000000"/>
+          <w:sz w:val="22"/>
+          <w:szCs w:val="22"/>
+        </w:rPr>
+        <w:t xml:space="preserve"> </w:t>
+      </w:r>
+    </w:p>
+    <w:p>
+      <w:pPr>
+        <w:keepNext/>
+        <w:tabs>
+          <w:tab w:pos="10440" w:val="right"/>
+        </w:tabs>
+        <w:spacing w:before="120" w:after="20" w:line="240" w:lineRule="auto"/>
+      </w:pPr>
+      <w:r>
+        <w:rPr>
+          <w:rFonts w:ascii="Arial" w:hAnsi="Arial"/>
+          <w:b/>
+          <w:sz w:val="20"/>
+        </w:rPr>
+        <w:t>Data Analysis with Python (IBM DA0101EN)</w:t>
+      </w:r>
+      <w:r>
+        <w:rPr>
+          <w:rFonts w:ascii="Arial" w:hAnsi="Arial"/>
+          <w:sz w:val="20"/>
+        </w:rPr>
+        <w:tab/>
+        <w:t>May 2026</w:t>
+      </w:r>
+    </w:p>
+    <w:p>
+      <w:pPr>
+        <w:keepNext/>
+        <w:spacing w:after="20" w:line="240" w:lineRule="auto"/>
+      </w:pPr>
+      <w:r>
+        <w:rPr>
+          <w:rFonts w:ascii="Arial" w:hAnsi="Arial"/>
+          <w:sz w:val="20"/>
+        </w:rPr>
+        <w:t>IBM SkillsBuild</w:t>
+      </w:r>
+    </w:p>
+    <w:p>
+      <w:pPr>
+        <w:keepNext/>
+        <w:tabs>
+          <w:tab w:pos="10440" w:val="right"/>
+        </w:tabs>
+        <w:spacing w:before="120" w:after="20" w:line="240" w:lineRule="auto"/>
+      </w:pPr>
+      <w:r>
+        <w:rPr>
+          <w:rFonts w:ascii="Arial" w:hAnsi="Arial"/>
+          <w:b/>
+          <w:sz w:val="20"/>
+        </w:rPr>
+        <w:t>Data Visualization with Python (IBM DV0101EN)</w:t>
+      </w:r>
+      <w:r>
+        <w:rPr>
+          <w:rFonts w:ascii="Arial" w:hAnsi="Arial"/>
+          <w:sz w:val="20"/>
+        </w:rPr>
+        <w:tab/>
+        <w:t>May 2026</w:t>
+      </w:r>
+    </w:p>
+    <w:p>
+      <w:pPr>
+        <w:keepNext/>
+        <w:spacing w:after="20" w:line="240" w:lineRule="auto"/>
+      </w:pPr>
+      <w:r>
+        <w:rPr>
+          <w:rFonts w:ascii="Arial" w:hAnsi="Arial"/>
+          <w:sz w:val="20"/>
+        </w:rPr>
+        <w:t>IBM SkillsBuild</w:t>
+      </w:r>
+    </w:p>
+    <w:p>
+      <w:pPr>
+        <w:keepNext/>
+        <w:tabs>
+          <w:tab w:pos="10440" w:val="right"/>
+        </w:tabs>
+        <w:spacing w:before="120" w:after="20" w:line="240" w:lineRule="auto"/>
+      </w:pPr>
+      <w:r>
+        <w:rPr>
+          <w:rFonts w:ascii="Arial" w:hAnsi="Arial"/>
+          <w:b/>
+          <w:sz w:val="20"/>
+        </w:rPr>
+        <w:t>Intro to Machine Learning</w:t>
+      </w:r>
+      <w:r>
+        <w:rPr>
+          <w:rFonts w:ascii="Arial" w:hAnsi="Arial"/>
+          <w:sz w:val="20"/>
+        </w:rPr>
+        <w:tab/>
+        <w:t>Mar 2026</w:t>
+      </w:r>
+    </w:p>
+    <w:p>
+      <w:pPr>
+        <w:keepNext/>
+        <w:spacing w:after="20" w:line="240" w:lineRule="auto"/>
+      </w:pPr>
+      <w:r>
+        <w:rPr>
+          <w:rFonts w:ascii="Arial" w:hAnsi="Arial"/>
+          <w:sz w:val="20"/>
+        </w:rPr>
+        <w:t>Kaggle</w:t>
+      </w:r>
+    </w:p>
+    <w:p>
+      <w:pPr>
+        <w:keepNext/>
+        <w:tabs>
+          <w:tab w:pos="10440" w:val="right"/>
+        </w:tabs>
+        <w:spacing w:before="120" w:after="20" w:line="240" w:lineRule="auto"/>
+      </w:pPr>
+      <w:r>
+        <w:rPr>
+          <w:rFonts w:ascii="Arial" w:hAnsi="Arial"/>
+          <w:b/>
+          <w:sz w:val="20"/>
+        </w:rPr>
+        <w:t>Certified Data Science Associate (CDSA)</w:t>
+      </w:r>
+      <w:r>
+        <w:rPr>
+          <w:rFonts w:ascii="Arial" w:hAnsi="Arial"/>
+          <w:sz w:val="20"/>
+        </w:rPr>
+        <w:tab/>
+        <w:t>Dec 2025</w:t>
+      </w:r>
+    </w:p>
+    <w:p>
+      <w:pPr>
+        <w:keepNext/>
+        <w:spacing w:after="20" w:line="240" w:lineRule="auto"/>
+      </w:pPr>
+      <w:r>
+        <w:rPr>
+          <w:rFonts w:ascii="Arial" w:hAnsi="Arial"/>
+          <w:sz w:val="20"/>
         </w:rPr>
         <w:t>East West International Educational Specialists</w:t>
       </w:r>
-      <w:r>
-        <w:rPr>
-          <w:rFonts w:ascii="Calibri" w:eastAsia="Calibri" w:hAnsi="Calibri" w:cs="Calibri"/>
-        </w:rPr>
-        <w:tab/>
-        <w:t>Issued Dec 202</w:t>
-      </w:r>
-      <w:r>
-        <w:rPr>
-          <w:rFonts w:ascii="Calibri" w:eastAsia="Calibri" w:hAnsi="Calibri" w:cs="Calibri"/>
-        </w:rPr>
-        <w:t>5</w:t>
-      </w:r>
-    </w:p>
-    <w:p>
-      <w:pPr>
-        <w:spacing w:after="100"/>
-      </w:pPr>
-      <w:r>
-        <w:rPr>
-          <w:rFonts w:ascii="Calibri" w:eastAsia="Calibri" w:hAnsi="Calibri" w:cs="Calibri"/>
-          <w:color w:val="444444"/>
-          <w:sz w:val="18"/>
-          <w:szCs w:val="18"/>
-        </w:rPr>
-        <w:t>Credential ID: skZhIPZb</w:t>
-      </w:r>
-    </w:p>
-    <w:p>
-      <w:pPr>
-        <w:tabs>
-          <w:tab w:val="right" w:pos="9360"/>
-        </w:tabs>
-        <w:spacing w:after="20"/>
-      </w:pPr>
-      <w:r>
-        <w:rPr>
-          <w:rFonts w:ascii="Calibri" w:eastAsia="Calibri" w:hAnsi="Calibri" w:cs="Calibri"/>
-          <w:b/>
-          <w:bCs/>
-        </w:rPr>
-        <w:t xml:space="preserve">Data Analysis with Python (IBM DA0101EN) | </w:t>
-      </w:r>
-      <w:r>
-        <w:rPr>
-          <w:rFonts w:ascii="Calibri" w:eastAsia="Calibri" w:hAnsi="Calibri" w:cs="Calibri"/>
-        </w:rPr>
-        <w:t>IBM SkillsBuild</w:t>
-      </w:r>
-      <w:r>
-        <w:rPr>
-          <w:rFonts w:ascii="Calibri" w:eastAsia="Calibri" w:hAnsi="Calibri" w:cs="Calibri"/>
-        </w:rPr>
-        <w:tab/>
-        <w:t>Issued May 2026</w:t>
-      </w:r>
-    </w:p>
-    <w:p>
-      <w:pPr>
-        <w:spacing w:after="100"/>
-      </w:pPr>
-      <w:r>
-        <w:rPr>
-          <w:rFonts w:ascii="Calibri" w:eastAsia="Calibri" w:hAnsi="Calibri" w:cs="Calibri"/>
-          <w:color w:val="444444"/>
-          <w:sz w:val="18"/>
-          <w:szCs w:val="18"/>
-        </w:rPr>
-        <w:t>Credential ID: 9bbd407202f54fb6af4247a188f9c4c9</w:t>
-      </w:r>
-    </w:p>
-    <w:p>
-      <w:pPr>
-        <w:tabs>
-          <w:tab w:val="right" w:pos="9360"/>
-        </w:tabs>
-        <w:spacing w:after="20"/>
-      </w:pPr>
-      <w:r>
-        <w:rPr>
-          <w:rFonts w:ascii="Calibri" w:eastAsia="Calibri" w:hAnsi="Calibri" w:cs="Calibri"/>
-          <w:b/>
-          <w:bCs/>
-        </w:rPr>
-        <w:t xml:space="preserve">Data Visualization with Python (IBM DV0101EN) | </w:t>
-      </w:r>
-      <w:r>
-        <w:rPr>
-          <w:rFonts w:ascii="Calibri" w:eastAsia="Calibri" w:hAnsi="Calibri" w:cs="Calibri"/>
-        </w:rPr>
-        <w:t>IBM SkillsBuild</w:t>
-      </w:r>
-      <w:r>
-        <w:rPr>
-          <w:rFonts w:ascii="Calibri" w:eastAsia="Calibri" w:hAnsi="Calibri" w:cs="Calibri"/>
-        </w:rPr>
-        <w:tab/>
-        <w:t>Issued May 2026</w:t>
-      </w:r>
-    </w:p>
-    <w:p>
-      <w:pPr>
-        <w:spacing w:after="100"/>
-      </w:pPr>
-      <w:r>
-        <w:rPr>
-          <w:rFonts w:ascii="Calibri" w:eastAsia="Calibri" w:hAnsi="Calibri" w:cs="Calibri"/>
-          <w:color w:val="444444"/>
-          <w:sz w:val="18"/>
-          <w:szCs w:val="18"/>
-        </w:rPr>
-        <w:t>Credential ID: e8535d67aeea49cb848c12bb9d1d208b</w:t>
-      </w:r>
-    </w:p>
-    <w:p>
-      <w:pPr>
-        <w:tabs>
-          <w:tab w:val="right" w:pos="9360"/>
-        </w:tabs>
-        <w:spacing w:after="20"/>
-      </w:pPr>
-      <w:r>
-        <w:rPr>
-          <w:rFonts w:ascii="Calibri" w:eastAsia="Calibri" w:hAnsi="Calibri" w:cs="Calibri"/>
-          <w:b/>
-          <w:bCs/>
-        </w:rPr>
-        <w:t xml:space="preserve">Intro to Machine Learning | </w:t>
-      </w:r>
-      <w:r>
-        <w:rPr>
-          <w:rFonts w:ascii="Calibri" w:eastAsia="Calibri" w:hAnsi="Calibri" w:cs="Calibri"/>
-        </w:rPr>
-        <w:t xml:space="preserve">Kaggle</w:t>
-      </w:r>
-      <w:r>
-        <w:rPr>
-          <w:rFonts w:ascii="Calibri" w:eastAsia="Calibri" w:hAnsi="Calibri" w:cs="Calibri"/>
-        </w:rPr>
-        <w:tab/>
-        <w:t xml:space="preserve">Issued Mar 2026</w:t>
-      </w:r>
-    </w:p>
-    <w:p>
-      <w:pPr>
-        <w:tabs>
-          <w:tab w:val="right" w:pos="9360"/>
-        </w:tabs>
-        <w:spacing w:after="20"/>
-      </w:pPr>
-      <w:r>
-        <w:rPr>
-          <w:rFonts w:ascii="Calibri" w:eastAsia="Calibri" w:hAnsi="Calibri" w:cs="Calibri"/>
-          <w:b/>
-          <w:bCs/>
-        </w:rPr>
-        <w:t xml:space="preserve">JavaScript for Beginners | </w:t>
-      </w:r>
-      <w:r>
-        <w:rPr>
-          <w:rFonts w:ascii="Calibri" w:eastAsia="Calibri" w:hAnsi="Calibri" w:cs="Calibri"/>
-        </w:rPr>
-        <w:t xml:space="preserve">Simplilearn</w:t>
-      </w:r>
-      <w:r>
-        <w:rPr>
-          <w:rFonts w:ascii="Calibri" w:eastAsia="Calibri" w:hAnsi="Calibri" w:cs="Calibri"/>
-        </w:rPr>
-        <w:tab/>
-        <w:t xml:space="preserve">Issued Mar 2025</w:t>
-      </w:r>
-    </w:p>
-    <w:p>
-      <w:pPr>
-        <w:spacing w:after="100"/>
-      </w:pPr>
-      <w:r>
-        <w:rPr>
-          <w:rFonts w:ascii="Calibri" w:eastAsia="Calibri" w:hAnsi="Calibri" w:cs="Calibri"/>
-          <w:color w:val="444444"/>
-          <w:sz w:val="18"/>
-          <w:szCs w:val="18"/>
-        </w:rPr>
-        <w:t xml:space="preserve">Credential ID: 7983372</w:t>
-      </w:r>
+    </w:p>
+    <w:p>
+      <w:pPr>
+        <w:rPr>
+          <w:rFonts w:ascii="Arial" w:hAnsi="Arial" w:cs="Arial"/>
+        </w:rPr>
+      </w:pPr>
     </w:p>
     <w:sectPr>
       <w:pgSz w:w="12240" w:h="15840"/>
@@ -766,6 +850,571 @@
 <file path=word/numbering.xml><?xml version="1.0" encoding="utf-8"?>
 <w:numbering xmlns:wpc="http://schemas.microsoft.com/office/word/2010/wordprocessingCanvas" xmlns:cx="http://schemas.microsoft.com/office/drawing/2014/chartex" xmlns:cx1="http://schemas.microsoft.com/office/drawing/2015/9/8/chartex" xmlns:cx2="http://schemas.microsoft.com/office/drawing/2015/10/21/chartex" xmlns:cx3="http://schemas.microsoft.com/office/drawing/2016/5/9/chartex" xmlns:cx4="http://schemas.microsoft.com/office/drawing/2016/5/10/chartex" xmlns:cx5="http://schemas.microsoft.com/office/drawing/2016/5/11/chartex" xmlns:cx6="http://schemas.microsoft.com/office/drawing/2016/5/12/chartex" xmlns:cx7="http://schemas.microsoft.com/office/drawing/2016/5/13/chartex" xmlns:cx8="http://schemas.microsoft.com/office/drawing/2016/5/14/chartex" xmlns:mc="http://schemas.openxmlformats.org/markup-compatibility/2006" xmlns:aink="http://schemas.microsoft.com/office/drawing/2016/ink" xmlns:am3d="http://schemas.microsoft.com/office/drawing/2017/model3d" xmlns:o="urn:schemas-microsoft-com:office:office" xmlns:oel="http://schemas.microsoft.com/office/2019/extlst" xmlns:r="http://schemas.openxmlformats.org/officeDocument/2006/relationships" xmlns:m="http://schemas.openxmlformats.org/officeDocument/2006/math" xmlns:v="urn:schemas-microsoft-com:vml" xmlns:wp14="http://schemas.microsoft.com/office/word/2010/wordprocessingDrawing" xmlns:wp="http://schemas.openxmlformats.org/drawingml/2006/wordprocessingDrawing" xmlns:w10="urn:schemas-microsoft-com:office:word" xmlns:w="http://schemas.openxmlformats.org/wordprocessingml/2006/main" xmlns:w14="http://schemas.microsoft.com/office/word/2010/wordml" xmlns:w15="http://schemas.microsoft.com/office/word/2012/wordml" xmlns:w16cex="http://schemas.microsoft.com/office/word/2018/wordml/cex" xmlns:w16cid="http://schemas.microsoft.com/office/word/2016/wordml/cid" xmlns:w16="http://schemas.microsoft.com/office/word/2018/wordml" xmlns:w16sdtdh="http://schemas.microsoft.com/office/word/2020/wordml/sdtdatahash" xmlns:w16se="http://schemas.microsoft.com/office/word/2015/wordml/symex" xmlns:wpg="http://schemas.microsoft.com/office/word/2010/wordprocessingGroup" xmlns:wpi="http://schemas.microsoft.com/office/word/2010/wordprocessingInk" xmlns:wne="http://schemas.microsoft.com/office/word/2006/wordml" xmlns:wps="http://schemas.microsoft.com/office/word/2010/wordprocessingShape" mc:Ignorable="w14 w15 w16se w16cid w16 w16cex w16sdtdh wp14">
   <w:abstractNum w:abstractNumId="0" w15:restartNumberingAfterBreak="0">
+    <w:nsid w:val="04FB537A"/>
+    <w:multiLevelType w:val="hybridMultilevel"/>
+    <w:tmpl w:val="6B2A95A8"/>
+    <w:lvl w:ilvl="0" w:tplc="34090001">
+      <w:start w:val="1"/>
+      <w:numFmt w:val="bullet"/>
+      <w:lvlText w:val=""/>
+      <w:lvlJc w:val="left"/>
+      <w:pPr>
+        <w:ind w:left="865" w:hanging="360"/>
+      </w:pPr>
+      <w:rPr>
+        <w:rFonts w:ascii="Symbol" w:hAnsi="Symbol" w:hint="default"/>
+      </w:rPr>
+    </w:lvl>
+    <w:lvl w:ilvl="1" w:tplc="34090003" w:tentative="1">
+      <w:start w:val="1"/>
+      <w:numFmt w:val="bullet"/>
+      <w:lvlText w:val="o"/>
+      <w:lvlJc w:val="left"/>
+      <w:pPr>
+        <w:ind w:left="1585" w:hanging="360"/>
+      </w:pPr>
+      <w:rPr>
+        <w:rFonts w:ascii="Courier New" w:hAnsi="Courier New" w:cs="Courier New" w:hint="default"/>
+      </w:rPr>
+    </w:lvl>
+    <w:lvl w:ilvl="2" w:tplc="34090005" w:tentative="1">
+      <w:start w:val="1"/>
+      <w:numFmt w:val="bullet"/>
+      <w:lvlText w:val=""/>
+      <w:lvlJc w:val="left"/>
+      <w:pPr>
+        <w:ind w:left="2305" w:hanging="360"/>
+      </w:pPr>
+      <w:rPr>
+        <w:rFonts w:ascii="Wingdings" w:hAnsi="Wingdings" w:hint="default"/>
+      </w:rPr>
+    </w:lvl>
+    <w:lvl w:ilvl="3" w:tplc="34090001" w:tentative="1">
+      <w:start w:val="1"/>
+      <w:numFmt w:val="bullet"/>
+      <w:lvlText w:val=""/>
+      <w:lvlJc w:val="left"/>
+      <w:pPr>
+        <w:ind w:left="3025" w:hanging="360"/>
+      </w:pPr>
+      <w:rPr>
+        <w:rFonts w:ascii="Symbol" w:hAnsi="Symbol" w:hint="default"/>
+      </w:rPr>
+    </w:lvl>
+    <w:lvl w:ilvl="4" w:tplc="34090003" w:tentative="1">
+      <w:start w:val="1"/>
+      <w:numFmt w:val="bullet"/>
+      <w:lvlText w:val="o"/>
+      <w:lvlJc w:val="left"/>
+      <w:pPr>
+        <w:ind w:left="3745" w:hanging="360"/>
+      </w:pPr>
+      <w:rPr>
+        <w:rFonts w:ascii="Courier New" w:hAnsi="Courier New" w:cs="Courier New" w:hint="default"/>
+      </w:rPr>
+    </w:lvl>
+    <w:lvl w:ilvl="5" w:tplc="34090005" w:tentative="1">
+      <w:start w:val="1"/>
+      <w:numFmt w:val="bullet"/>
+      <w:lvlText w:val=""/>
+      <w:lvlJc w:val="left"/>
+      <w:pPr>
+        <w:ind w:left="4465" w:hanging="360"/>
+      </w:pPr>
+      <w:rPr>
+        <w:rFonts w:ascii="Wingdings" w:hAnsi="Wingdings" w:hint="default"/>
+      </w:rPr>
+    </w:lvl>
+    <w:lvl w:ilvl="6" w:tplc="34090001" w:tentative="1">
+      <w:start w:val="1"/>
+      <w:numFmt w:val="bullet"/>
+      <w:lvlText w:val=""/>
+      <w:lvlJc w:val="left"/>
+      <w:pPr>
+        <w:ind w:left="5185" w:hanging="360"/>
+      </w:pPr>
+      <w:rPr>
+        <w:rFonts w:ascii="Symbol" w:hAnsi="Symbol" w:hint="default"/>
+      </w:rPr>
+    </w:lvl>
+    <w:lvl w:ilvl="7" w:tplc="34090003" w:tentative="1">
+      <w:start w:val="1"/>
+      <w:numFmt w:val="bullet"/>
+      <w:lvlText w:val="o"/>
+      <w:lvlJc w:val="left"/>
+      <w:pPr>
+        <w:ind w:left="5905" w:hanging="360"/>
+      </w:pPr>
+      <w:rPr>
+        <w:rFonts w:ascii="Courier New" w:hAnsi="Courier New" w:cs="Courier New" w:hint="default"/>
+      </w:rPr>
+    </w:lvl>
+    <w:lvl w:ilvl="8" w:tplc="34090005" w:tentative="1">
+      <w:start w:val="1"/>
+      <w:numFmt w:val="bullet"/>
+      <w:lvlText w:val=""/>
+      <w:lvlJc w:val="left"/>
+      <w:pPr>
+        <w:ind w:left="6625" w:hanging="360"/>
+      </w:pPr>
+      <w:rPr>
+        <w:rFonts w:ascii="Wingdings" w:hAnsi="Wingdings" w:hint="default"/>
+      </w:rPr>
+    </w:lvl>
+  </w:abstractNum>
+  <w:abstractNum w:abstractNumId="1" w15:restartNumberingAfterBreak="0">
+    <w:nsid w:val="07EF094C"/>
+    <w:multiLevelType w:val="hybridMultilevel"/>
+    <w:tmpl w:val="AB90665A"/>
+    <w:lvl w:ilvl="0" w:tplc="34090001">
+      <w:start w:val="1"/>
+      <w:numFmt w:val="bullet"/>
+      <w:lvlText w:val=""/>
+      <w:lvlJc w:val="left"/>
+      <w:pPr>
+        <w:ind w:left="720" w:hanging="360"/>
+      </w:pPr>
+      <w:rPr>
+        <w:rFonts w:ascii="Symbol" w:hAnsi="Symbol" w:hint="default"/>
+      </w:rPr>
+    </w:lvl>
+    <w:lvl w:ilvl="1" w:tplc="34090003" w:tentative="1">
+      <w:start w:val="1"/>
+      <w:numFmt w:val="bullet"/>
+      <w:lvlText w:val="o"/>
+      <w:lvlJc w:val="left"/>
+      <w:pPr>
+        <w:ind w:left="1440" w:hanging="360"/>
+      </w:pPr>
+      <w:rPr>
+        <w:rFonts w:ascii="Courier New" w:hAnsi="Courier New" w:cs="Courier New" w:hint="default"/>
+      </w:rPr>
+    </w:lvl>
+    <w:lvl w:ilvl="2" w:tplc="34090005" w:tentative="1">
+      <w:start w:val="1"/>
+      <w:numFmt w:val="bullet"/>
+      <w:lvlText w:val=""/>
+      <w:lvlJc w:val="left"/>
+      <w:pPr>
+        <w:ind w:left="2160" w:hanging="360"/>
+      </w:pPr>
+      <w:rPr>
+        <w:rFonts w:ascii="Wingdings" w:hAnsi="Wingdings" w:hint="default"/>
+      </w:rPr>
+    </w:lvl>
+    <w:lvl w:ilvl="3" w:tplc="34090001" w:tentative="1">
+      <w:start w:val="1"/>
+      <w:numFmt w:val="bullet"/>
+      <w:lvlText w:val=""/>
+      <w:lvlJc w:val="left"/>
+      <w:pPr>
+        <w:ind w:left="2880" w:hanging="360"/>
+      </w:pPr>
+      <w:rPr>
+        <w:rFonts w:ascii="Symbol" w:hAnsi="Symbol" w:hint="default"/>
+      </w:rPr>
+    </w:lvl>
+    <w:lvl w:ilvl="4" w:tplc="34090003" w:tentative="1">
+      <w:start w:val="1"/>
+      <w:numFmt w:val="bullet"/>
+      <w:lvlText w:val="o"/>
+      <w:lvlJc w:val="left"/>
+      <w:pPr>
+        <w:ind w:left="3600" w:hanging="360"/>
+      </w:pPr>
+      <w:rPr>
+        <w:rFonts w:ascii="Courier New" w:hAnsi="Courier New" w:cs="Courier New" w:hint="default"/>
+      </w:rPr>
+    </w:lvl>
+    <w:lvl w:ilvl="5" w:tplc="34090005" w:tentative="1">
+      <w:start w:val="1"/>
+      <w:numFmt w:val="bullet"/>
+      <w:lvlText w:val=""/>
+      <w:lvlJc w:val="left"/>
+      <w:pPr>
+        <w:ind w:left="4320" w:hanging="360"/>
+      </w:pPr>
+      <w:rPr>
+        <w:rFonts w:ascii="Wingdings" w:hAnsi="Wingdings" w:hint="default"/>
+      </w:rPr>
+    </w:lvl>
+    <w:lvl w:ilvl="6" w:tplc="34090001" w:tentative="1">
+      <w:start w:val="1"/>
+      <w:numFmt w:val="bullet"/>
+      <w:lvlText w:val=""/>
+      <w:lvlJc w:val="left"/>
+      <w:pPr>
+        <w:ind w:left="5040" w:hanging="360"/>
+      </w:pPr>
+      <w:rPr>
+        <w:rFonts w:ascii="Symbol" w:hAnsi="Symbol" w:hint="default"/>
+      </w:rPr>
+    </w:lvl>
+    <w:lvl w:ilvl="7" w:tplc="34090003" w:tentative="1">
+      <w:start w:val="1"/>
+      <w:numFmt w:val="bullet"/>
+      <w:lvlText w:val="o"/>
+      <w:lvlJc w:val="left"/>
+      <w:pPr>
+        <w:ind w:left="5760" w:hanging="360"/>
+      </w:pPr>
+      <w:rPr>
+        <w:rFonts w:ascii="Courier New" w:hAnsi="Courier New" w:cs="Courier New" w:hint="default"/>
+      </w:rPr>
+    </w:lvl>
+    <w:lvl w:ilvl="8" w:tplc="34090005" w:tentative="1">
+      <w:start w:val="1"/>
+      <w:numFmt w:val="bullet"/>
+      <w:lvlText w:val=""/>
+      <w:lvlJc w:val="left"/>
+      <w:pPr>
+        <w:ind w:left="6480" w:hanging="360"/>
+      </w:pPr>
+      <w:rPr>
+        <w:rFonts w:ascii="Wingdings" w:hAnsi="Wingdings" w:hint="default"/>
+      </w:rPr>
+    </w:lvl>
+  </w:abstractNum>
+  <w:abstractNum w:abstractNumId="2" w15:restartNumberingAfterBreak="0">
+    <w:nsid w:val="13252FE8"/>
+    <w:multiLevelType w:val="hybridMultilevel"/>
+    <w:tmpl w:val="221E28D4"/>
+    <w:lvl w:ilvl="0" w:tplc="34090001">
+      <w:start w:val="1"/>
+      <w:numFmt w:val="bullet"/>
+      <w:lvlText w:val=""/>
+      <w:lvlJc w:val="left"/>
+      <w:pPr>
+        <w:ind w:left="720" w:hanging="360"/>
+      </w:pPr>
+      <w:rPr>
+        <w:rFonts w:ascii="Symbol" w:hAnsi="Symbol" w:hint="default"/>
+      </w:rPr>
+    </w:lvl>
+    <w:lvl w:ilvl="1" w:tplc="34090003" w:tentative="1">
+      <w:start w:val="1"/>
+      <w:numFmt w:val="bullet"/>
+      <w:lvlText w:val="o"/>
+      <w:lvlJc w:val="left"/>
+      <w:pPr>
+        <w:ind w:left="1440" w:hanging="360"/>
+      </w:pPr>
+      <w:rPr>
+        <w:rFonts w:ascii="Courier New" w:hAnsi="Courier New" w:cs="Courier New" w:hint="default"/>
+      </w:rPr>
+    </w:lvl>
+    <w:lvl w:ilvl="2" w:tplc="34090005" w:tentative="1">
+      <w:start w:val="1"/>
+      <w:numFmt w:val="bullet"/>
+      <w:lvlText w:val=""/>
+      <w:lvlJc w:val="left"/>
+      <w:pPr>
+        <w:ind w:left="2160" w:hanging="360"/>
+      </w:pPr>
+      <w:rPr>
+        <w:rFonts w:ascii="Wingdings" w:hAnsi="Wingdings" w:hint="default"/>
+      </w:rPr>
+    </w:lvl>
+    <w:lvl w:ilvl="3" w:tplc="34090001" w:tentative="1">
+      <w:start w:val="1"/>
+      <w:numFmt w:val="bullet"/>
+      <w:lvlText w:val=""/>
+      <w:lvlJc w:val="left"/>
+      <w:pPr>
+        <w:ind w:left="2880" w:hanging="360"/>
+      </w:pPr>
+      <w:rPr>
+        <w:rFonts w:ascii="Symbol" w:hAnsi="Symbol" w:hint="default"/>
+      </w:rPr>
+    </w:lvl>
+    <w:lvl w:ilvl="4" w:tplc="34090003" w:tentative="1">
+      <w:start w:val="1"/>
+      <w:numFmt w:val="bullet"/>
+      <w:lvlText w:val="o"/>
+      <w:lvlJc w:val="left"/>
+      <w:pPr>
+        <w:ind w:left="3600" w:hanging="360"/>
+      </w:pPr>
+      <w:rPr>
+        <w:rFonts w:ascii="Courier New" w:hAnsi="Courier New" w:cs="Courier New" w:hint="default"/>
+      </w:rPr>
+    </w:lvl>
+    <w:lvl w:ilvl="5" w:tplc="34090005" w:tentative="1">
+      <w:start w:val="1"/>
+      <w:numFmt w:val="bullet"/>
+      <w:lvlText w:val=""/>
+      <w:lvlJc w:val="left"/>
+      <w:pPr>
+        <w:ind w:left="4320" w:hanging="360"/>
+      </w:pPr>
+      <w:rPr>
+        <w:rFonts w:ascii="Wingdings" w:hAnsi="Wingdings" w:hint="default"/>
+      </w:rPr>
+    </w:lvl>
+    <w:lvl w:ilvl="6" w:tplc="34090001" w:tentative="1">
+      <w:start w:val="1"/>
+      <w:numFmt w:val="bullet"/>
+      <w:lvlText w:val=""/>
+      <w:lvlJc w:val="left"/>
+      <w:pPr>
+        <w:ind w:left="5040" w:hanging="360"/>
+      </w:pPr>
+      <w:rPr>
+        <w:rFonts w:ascii="Symbol" w:hAnsi="Symbol" w:hint="default"/>
+      </w:rPr>
+    </w:lvl>
+    <w:lvl w:ilvl="7" w:tplc="34090003" w:tentative="1">
+      <w:start w:val="1"/>
+      <w:numFmt w:val="bullet"/>
+      <w:lvlText w:val="o"/>
+      <w:lvlJc w:val="left"/>
+      <w:pPr>
+        <w:ind w:left="5760" w:hanging="360"/>
+      </w:pPr>
+      <w:rPr>
+        <w:rFonts w:ascii="Courier New" w:hAnsi="Courier New" w:cs="Courier New" w:hint="default"/>
+      </w:rPr>
+    </w:lvl>
+    <w:lvl w:ilvl="8" w:tplc="34090005" w:tentative="1">
+      <w:start w:val="1"/>
+      <w:numFmt w:val="bullet"/>
+      <w:lvlText w:val=""/>
+      <w:lvlJc w:val="left"/>
+      <w:pPr>
+        <w:ind w:left="6480" w:hanging="360"/>
+      </w:pPr>
+      <w:rPr>
+        <w:rFonts w:ascii="Wingdings" w:hAnsi="Wingdings" w:hint="default"/>
+      </w:rPr>
+    </w:lvl>
+  </w:abstractNum>
+  <w:abstractNum w:abstractNumId="3" w15:restartNumberingAfterBreak="0">
+    <w:nsid w:val="13D4541F"/>
+    <w:multiLevelType w:val="hybridMultilevel"/>
+    <w:tmpl w:val="DABA9394"/>
+    <w:lvl w:ilvl="0" w:tplc="34090001">
+      <w:start w:val="1"/>
+      <w:numFmt w:val="bullet"/>
+      <w:lvlText w:val=""/>
+      <w:lvlJc w:val="left"/>
+      <w:pPr>
+        <w:ind w:left="720" w:hanging="360"/>
+      </w:pPr>
+      <w:rPr>
+        <w:rFonts w:ascii="Symbol" w:hAnsi="Symbol" w:hint="default"/>
+      </w:rPr>
+    </w:lvl>
+    <w:lvl w:ilvl="1" w:tplc="34090003" w:tentative="1">
+      <w:start w:val="1"/>
+      <w:numFmt w:val="bullet"/>
+      <w:lvlText w:val="o"/>
+      <w:lvlJc w:val="left"/>
+      <w:pPr>
+        <w:ind w:left="1440" w:hanging="360"/>
+      </w:pPr>
+      <w:rPr>
+        <w:rFonts w:ascii="Courier New" w:hAnsi="Courier New" w:cs="Courier New" w:hint="default"/>
+      </w:rPr>
+    </w:lvl>
+    <w:lvl w:ilvl="2" w:tplc="34090005" w:tentative="1">
+      <w:start w:val="1"/>
+      <w:numFmt w:val="bullet"/>
+      <w:lvlText w:val=""/>
+      <w:lvlJc w:val="left"/>
+      <w:pPr>
+        <w:ind w:left="2160" w:hanging="360"/>
+      </w:pPr>
+      <w:rPr>
+        <w:rFonts w:ascii="Wingdings" w:hAnsi="Wingdings" w:hint="default"/>
+      </w:rPr>
+    </w:lvl>
+    <w:lvl w:ilvl="3" w:tplc="34090001" w:tentative="1">
+      <w:start w:val="1"/>
+      <w:numFmt w:val="bullet"/>
+      <w:lvlText w:val=""/>
+      <w:lvlJc w:val="left"/>
+      <w:pPr>
+        <w:ind w:left="2880" w:hanging="360"/>
+      </w:pPr>
+      <w:rPr>
+        <w:rFonts w:ascii="Symbol" w:hAnsi="Symbol" w:hint="default"/>
+      </w:rPr>
+    </w:lvl>
+    <w:lvl w:ilvl="4" w:tplc="34090003" w:tentative="1">
+      <w:start w:val="1"/>
+      <w:numFmt w:val="bullet"/>
+      <w:lvlText w:val="o"/>
+      <w:lvlJc w:val="left"/>
+      <w:pPr>
+        <w:ind w:left="3600" w:hanging="360"/>
+      </w:pPr>
+      <w:rPr>
+        <w:rFonts w:ascii="Courier New" w:hAnsi="Courier New" w:cs="Courier New" w:hint="default"/>
+      </w:rPr>
+    </w:lvl>
+    <w:lvl w:ilvl="5" w:tplc="34090005" w:tentative="1">
+      <w:start w:val="1"/>
+      <w:numFmt w:val="bullet"/>
+      <w:lvlText w:val=""/>
+      <w:lvlJc w:val="left"/>
+      <w:pPr>
+        <w:ind w:left="4320" w:hanging="360"/>
+      </w:pPr>
+      <w:rPr>
+        <w:rFonts w:ascii="Wingdings" w:hAnsi="Wingdings" w:hint="default"/>
+      </w:rPr>
+    </w:lvl>
+    <w:lvl w:ilvl="6" w:tplc="34090001" w:tentative="1">
+      <w:start w:val="1"/>
+      <w:numFmt w:val="bullet"/>
+      <w:lvlText w:val=""/>
+      <w:lvlJc w:val="left"/>
+      <w:pPr>
+        <w:ind w:left="5040" w:hanging="360"/>
+      </w:pPr>
+      <w:rPr>
+        <w:rFonts w:ascii="Symbol" w:hAnsi="Symbol" w:hint="default"/>
+      </w:rPr>
+    </w:lvl>
+    <w:lvl w:ilvl="7" w:tplc="34090003" w:tentative="1">
+      <w:start w:val="1"/>
+      <w:numFmt w:val="bullet"/>
+      <w:lvlText w:val="o"/>
+      <w:lvlJc w:val="left"/>
+      <w:pPr>
+        <w:ind w:left="5760" w:hanging="360"/>
+      </w:pPr>
+      <w:rPr>
+        <w:rFonts w:ascii="Courier New" w:hAnsi="Courier New" w:cs="Courier New" w:hint="default"/>
+      </w:rPr>
+    </w:lvl>
+    <w:lvl w:ilvl="8" w:tplc="34090005" w:tentative="1">
+      <w:start w:val="1"/>
+      <w:numFmt w:val="bullet"/>
+      <w:lvlText w:val=""/>
+      <w:lvlJc w:val="left"/>
+      <w:pPr>
+        <w:ind w:left="6480" w:hanging="360"/>
+      </w:pPr>
+      <w:rPr>
+        <w:rFonts w:ascii="Wingdings" w:hAnsi="Wingdings" w:hint="default"/>
+      </w:rPr>
+    </w:lvl>
+  </w:abstractNum>
+  <w:abstractNum w:abstractNumId="4" w15:restartNumberingAfterBreak="0">
+    <w:nsid w:val="19CA1EF5"/>
+    <w:multiLevelType w:val="hybridMultilevel"/>
+    <w:tmpl w:val="A66C17E6"/>
+    <w:lvl w:ilvl="0" w:tplc="34090001">
+      <w:start w:val="1"/>
+      <w:numFmt w:val="bullet"/>
+      <w:lvlText w:val=""/>
+      <w:lvlJc w:val="left"/>
+      <w:pPr>
+        <w:ind w:left="865" w:hanging="360"/>
+      </w:pPr>
+      <w:rPr>
+        <w:rFonts w:ascii="Symbol" w:hAnsi="Symbol" w:hint="default"/>
+      </w:rPr>
+    </w:lvl>
+    <w:lvl w:ilvl="1" w:tplc="34090003" w:tentative="1">
+      <w:start w:val="1"/>
+      <w:numFmt w:val="bullet"/>
+      <w:lvlText w:val="o"/>
+      <w:lvlJc w:val="left"/>
+      <w:pPr>
+        <w:ind w:left="1585" w:hanging="360"/>
+      </w:pPr>
+      <w:rPr>
+        <w:rFonts w:ascii="Courier New" w:hAnsi="Courier New" w:cs="Courier New" w:hint="default"/>
+      </w:rPr>
+    </w:lvl>
+    <w:lvl w:ilvl="2" w:tplc="34090005" w:tentative="1">
+      <w:start w:val="1"/>
+      <w:numFmt w:val="bullet"/>
+      <w:lvlText w:val=""/>
+      <w:lvlJc w:val="left"/>
+      <w:pPr>
+        <w:ind w:left="2305" w:hanging="360"/>
+      </w:pPr>
+      <w:rPr>
+        <w:rFonts w:ascii="Wingdings" w:hAnsi="Wingdings" w:hint="default"/>
+      </w:rPr>
+    </w:lvl>
+    <w:lvl w:ilvl="3" w:tplc="34090001" w:tentative="1">
+      <w:start w:val="1"/>
+      <w:numFmt w:val="bullet"/>
+      <w:lvlText w:val=""/>
+      <w:lvlJc w:val="left"/>
+      <w:pPr>
+        <w:ind w:left="3025" w:hanging="360"/>
+      </w:pPr>
+      <w:rPr>
+        <w:rFonts w:ascii="Symbol" w:hAnsi="Symbol" w:hint="default"/>
+      </w:rPr>
+    </w:lvl>
+    <w:lvl w:ilvl="4" w:tplc="34090003" w:tentative="1">
+      <w:start w:val="1"/>
+      <w:numFmt w:val="bullet"/>
+      <w:lvlText w:val="o"/>
+      <w:lvlJc w:val="left"/>
+      <w:pPr>
+        <w:ind w:left="3745" w:hanging="360"/>
+      </w:pPr>
+      <w:rPr>
+        <w:rFonts w:ascii="Courier New" w:hAnsi="Courier New" w:cs="Courier New" w:hint="default"/>
+      </w:rPr>
+    </w:lvl>
+    <w:lvl w:ilvl="5" w:tplc="34090005" w:tentative="1">
+      <w:start w:val="1"/>
+      <w:numFmt w:val="bullet"/>
+      <w:lvlText w:val=""/>
+      <w:lvlJc w:val="left"/>
+      <w:pPr>
+        <w:ind w:left="4465" w:hanging="360"/>
+      </w:pPr>
+      <w:rPr>
+        <w:rFonts w:ascii="Wingdings" w:hAnsi="Wingdings" w:hint="default"/>
+      </w:rPr>
+    </w:lvl>
+    <w:lvl w:ilvl="6" w:tplc="34090001" w:tentative="1">
+      <w:start w:val="1"/>
+      <w:numFmt w:val="bullet"/>
+      <w:lvlText w:val=""/>
+      <w:lvlJc w:val="left"/>
+      <w:pPr>
+        <w:ind w:left="5185" w:hanging="360"/>
+      </w:pPr>
+      <w:rPr>
+        <w:rFonts w:ascii="Symbol" w:hAnsi="Symbol" w:hint="default"/>
+      </w:rPr>
+    </w:lvl>
+    <w:lvl w:ilvl="7" w:tplc="34090003" w:tentative="1">
+      <w:start w:val="1"/>
+      <w:numFmt w:val="bullet"/>
+      <w:lvlText w:val="o"/>
+      <w:lvlJc w:val="left"/>
+      <w:pPr>
+        <w:ind w:left="5905" w:hanging="360"/>
+      </w:pPr>
+      <w:rPr>
+        <w:rFonts w:ascii="Courier New" w:hAnsi="Courier New" w:cs="Courier New" w:hint="default"/>
+      </w:rPr>
+    </w:lvl>
+    <w:lvl w:ilvl="8" w:tplc="34090005" w:tentative="1">
+      <w:start w:val="1"/>
+      <w:numFmt w:val="bullet"/>
+      <w:lvlText w:val=""/>
+      <w:lvlJc w:val="left"/>
+      <w:pPr>
+        <w:ind w:left="6625" w:hanging="360"/>
+      </w:pPr>
+      <w:rPr>
+        <w:rFonts w:ascii="Wingdings" w:hAnsi="Wingdings" w:hint="default"/>
+      </w:rPr>
+    </w:lvl>
+  </w:abstractNum>
+  <w:abstractNum w:abstractNumId="5" w15:restartNumberingAfterBreak="0">
     <w:nsid w:val="34165B6F"/>
     <w:multiLevelType w:val="hybridMultilevel"/>
     <w:tmpl w:val="F14CB886"/>
@@ -851,11 +1500,257 @@
       </w:pPr>
     </w:lvl>
   </w:abstractNum>
+  <w:abstractNum w:abstractNumId="6" w15:restartNumberingAfterBreak="0">
+    <w:nsid w:val="3CD32114"/>
+    <w:multiLevelType w:val="hybridMultilevel"/>
+    <w:tmpl w:val="720CA186"/>
+    <w:lvl w:ilvl="0" w:tplc="867A7ED8">
+      <w:numFmt w:val="bullet"/>
+      <w:lvlText w:val="•"/>
+      <w:lvlJc w:val="left"/>
+      <w:pPr>
+        <w:ind w:left="505" w:hanging="360"/>
+      </w:pPr>
+      <w:rPr>
+        <w:rFonts w:ascii="Arial" w:eastAsia="Calibri" w:hAnsi="Arial" w:cs="Arial" w:hint="default"/>
+      </w:rPr>
+    </w:lvl>
+    <w:lvl w:ilvl="1" w:tplc="34090003" w:tentative="1">
+      <w:start w:val="1"/>
+      <w:numFmt w:val="bullet"/>
+      <w:lvlText w:val="o"/>
+      <w:lvlJc w:val="left"/>
+      <w:pPr>
+        <w:ind w:left="1225" w:hanging="360"/>
+      </w:pPr>
+      <w:rPr>
+        <w:rFonts w:ascii="Courier New" w:hAnsi="Courier New" w:cs="Courier New" w:hint="default"/>
+      </w:rPr>
+    </w:lvl>
+    <w:lvl w:ilvl="2" w:tplc="34090005" w:tentative="1">
+      <w:start w:val="1"/>
+      <w:numFmt w:val="bullet"/>
+      <w:lvlText w:val=""/>
+      <w:lvlJc w:val="left"/>
+      <w:pPr>
+        <w:ind w:left="1945" w:hanging="360"/>
+      </w:pPr>
+      <w:rPr>
+        <w:rFonts w:ascii="Wingdings" w:hAnsi="Wingdings" w:hint="default"/>
+      </w:rPr>
+    </w:lvl>
+    <w:lvl w:ilvl="3" w:tplc="34090001" w:tentative="1">
+      <w:start w:val="1"/>
+      <w:numFmt w:val="bullet"/>
+      <w:lvlText w:val=""/>
+      <w:lvlJc w:val="left"/>
+      <w:pPr>
+        <w:ind w:left="2665" w:hanging="360"/>
+      </w:pPr>
+      <w:rPr>
+        <w:rFonts w:ascii="Symbol" w:hAnsi="Symbol" w:hint="default"/>
+      </w:rPr>
+    </w:lvl>
+    <w:lvl w:ilvl="4" w:tplc="34090003" w:tentative="1">
+      <w:start w:val="1"/>
+      <w:numFmt w:val="bullet"/>
+      <w:lvlText w:val="o"/>
+      <w:lvlJc w:val="left"/>
+      <w:pPr>
+        <w:ind w:left="3385" w:hanging="360"/>
+      </w:pPr>
+      <w:rPr>
+        <w:rFonts w:ascii="Courier New" w:hAnsi="Courier New" w:cs="Courier New" w:hint="default"/>
+      </w:rPr>
+    </w:lvl>
+    <w:lvl w:ilvl="5" w:tplc="34090005" w:tentative="1">
+      <w:start w:val="1"/>
+      <w:numFmt w:val="bullet"/>
+      <w:lvlText w:val=""/>
+      <w:lvlJc w:val="left"/>
+      <w:pPr>
+        <w:ind w:left="4105" w:hanging="360"/>
+      </w:pPr>
+      <w:rPr>
+        <w:rFonts w:ascii="Wingdings" w:hAnsi="Wingdings" w:hint="default"/>
+      </w:rPr>
+    </w:lvl>
+    <w:lvl w:ilvl="6" w:tplc="34090001" w:tentative="1">
+      <w:start w:val="1"/>
+      <w:numFmt w:val="bullet"/>
+      <w:lvlText w:val=""/>
+      <w:lvlJc w:val="left"/>
+      <w:pPr>
+        <w:ind w:left="4825" w:hanging="360"/>
+      </w:pPr>
+      <w:rPr>
+        <w:rFonts w:ascii="Symbol" w:hAnsi="Symbol" w:hint="default"/>
+      </w:rPr>
+    </w:lvl>
+    <w:lvl w:ilvl="7" w:tplc="34090003" w:tentative="1">
+      <w:start w:val="1"/>
+      <w:numFmt w:val="bullet"/>
+      <w:lvlText w:val="o"/>
+      <w:lvlJc w:val="left"/>
+      <w:pPr>
+        <w:ind w:left="5545" w:hanging="360"/>
+      </w:pPr>
+      <w:rPr>
+        <w:rFonts w:ascii="Courier New" w:hAnsi="Courier New" w:cs="Courier New" w:hint="default"/>
+      </w:rPr>
+    </w:lvl>
+    <w:lvl w:ilvl="8" w:tplc="34090005" w:tentative="1">
+      <w:start w:val="1"/>
+      <w:numFmt w:val="bullet"/>
+      <w:lvlText w:val=""/>
+      <w:lvlJc w:val="left"/>
+      <w:pPr>
+        <w:ind w:left="6265" w:hanging="360"/>
+      </w:pPr>
+      <w:rPr>
+        <w:rFonts w:ascii="Wingdings" w:hAnsi="Wingdings" w:hint="default"/>
+      </w:rPr>
+    </w:lvl>
+  </w:abstractNum>
+  <w:abstractNum w:abstractNumId="7" w15:restartNumberingAfterBreak="0">
+    <w:nsid w:val="7EEF6BCD"/>
+    <w:multiLevelType w:val="hybridMultilevel"/>
+    <w:tmpl w:val="30CEDB6A"/>
+    <w:lvl w:ilvl="0" w:tplc="34090001">
+      <w:start w:val="1"/>
+      <w:numFmt w:val="bullet"/>
+      <w:lvlText w:val=""/>
+      <w:lvlJc w:val="left"/>
+      <w:pPr>
+        <w:ind w:left="505" w:hanging="360"/>
+      </w:pPr>
+      <w:rPr>
+        <w:rFonts w:ascii="Symbol" w:hAnsi="Symbol" w:hint="default"/>
+      </w:rPr>
+    </w:lvl>
+    <w:lvl w:ilvl="1" w:tplc="34090003" w:tentative="1">
+      <w:start w:val="1"/>
+      <w:numFmt w:val="bullet"/>
+      <w:lvlText w:val="o"/>
+      <w:lvlJc w:val="left"/>
+      <w:pPr>
+        <w:ind w:left="1225" w:hanging="360"/>
+      </w:pPr>
+      <w:rPr>
+        <w:rFonts w:ascii="Courier New" w:hAnsi="Courier New" w:cs="Courier New" w:hint="default"/>
+      </w:rPr>
+    </w:lvl>
+    <w:lvl w:ilvl="2" w:tplc="34090005" w:tentative="1">
+      <w:start w:val="1"/>
+      <w:numFmt w:val="bullet"/>
+      <w:lvlText w:val=""/>
+      <w:lvlJc w:val="left"/>
+      <w:pPr>
+        <w:ind w:left="1945" w:hanging="360"/>
+      </w:pPr>
+      <w:rPr>
+        <w:rFonts w:ascii="Wingdings" w:hAnsi="Wingdings" w:hint="default"/>
+      </w:rPr>
+    </w:lvl>
+    <w:lvl w:ilvl="3" w:tplc="34090001" w:tentative="1">
+      <w:start w:val="1"/>
+      <w:numFmt w:val="bullet"/>
+      <w:lvlText w:val=""/>
+      <w:lvlJc w:val="left"/>
+      <w:pPr>
+        <w:ind w:left="2665" w:hanging="360"/>
+      </w:pPr>
+      <w:rPr>
+        <w:rFonts w:ascii="Symbol" w:hAnsi="Symbol" w:hint="default"/>
+      </w:rPr>
+    </w:lvl>
+    <w:lvl w:ilvl="4" w:tplc="34090003" w:tentative="1">
+      <w:start w:val="1"/>
+      <w:numFmt w:val="bullet"/>
+      <w:lvlText w:val="o"/>
+      <w:lvlJc w:val="left"/>
+      <w:pPr>
+        <w:ind w:left="3385" w:hanging="360"/>
+      </w:pPr>
+      <w:rPr>
+        <w:rFonts w:ascii="Courier New" w:hAnsi="Courier New" w:cs="Courier New" w:hint="default"/>
+      </w:rPr>
+    </w:lvl>
+    <w:lvl w:ilvl="5" w:tplc="34090005" w:tentative="1">
+      <w:start w:val="1"/>
+      <w:numFmt w:val="bullet"/>
+      <w:lvlText w:val=""/>
+      <w:lvlJc w:val="left"/>
+      <w:pPr>
+        <w:ind w:left="4105" w:hanging="360"/>
+      </w:pPr>
+      <w:rPr>
+        <w:rFonts w:ascii="Wingdings" w:hAnsi="Wingdings" w:hint="default"/>
+      </w:rPr>
+    </w:lvl>
+    <w:lvl w:ilvl="6" w:tplc="34090001" w:tentative="1">
+      <w:start w:val="1"/>
+      <w:numFmt w:val="bullet"/>
+      <w:lvlText w:val=""/>
+      <w:lvlJc w:val="left"/>
+      <w:pPr>
+        <w:ind w:left="4825" w:hanging="360"/>
+      </w:pPr>
+      <w:rPr>
+        <w:rFonts w:ascii="Symbol" w:hAnsi="Symbol" w:hint="default"/>
+      </w:rPr>
+    </w:lvl>
+    <w:lvl w:ilvl="7" w:tplc="34090003" w:tentative="1">
+      <w:start w:val="1"/>
+      <w:numFmt w:val="bullet"/>
+      <w:lvlText w:val="o"/>
+      <w:lvlJc w:val="left"/>
+      <w:pPr>
+        <w:ind w:left="5545" w:hanging="360"/>
+      </w:pPr>
+      <w:rPr>
+        <w:rFonts w:ascii="Courier New" w:hAnsi="Courier New" w:cs="Courier New" w:hint="default"/>
+      </w:rPr>
+    </w:lvl>
+    <w:lvl w:ilvl="8" w:tplc="34090005" w:tentative="1">
+      <w:start w:val="1"/>
+      <w:numFmt w:val="bullet"/>
+      <w:lvlText w:val=""/>
+      <w:lvlJc w:val="left"/>
+      <w:pPr>
+        <w:ind w:left="6265" w:hanging="360"/>
+      </w:pPr>
+      <w:rPr>
+        <w:rFonts w:ascii="Wingdings" w:hAnsi="Wingdings" w:hint="default"/>
+      </w:rPr>
+    </w:lvl>
+  </w:abstractNum>
   <w:num w:numId="1" w16cid:durableId="927543791">
-    <w:abstractNumId w:val="0"/>
+    <w:abstractNumId w:val="5"/>
     <w:lvlOverride w:ilvl="0">
       <w:startOverride w:val="1"/>
     </w:lvlOverride>
+  </w:num>
+  <w:num w:numId="2" w16cid:durableId="1402680459">
+    <w:abstractNumId w:val="0"/>
+  </w:num>
+  <w:num w:numId="3" w16cid:durableId="1812206561">
+    <w:abstractNumId w:val="7"/>
+  </w:num>
+  <w:num w:numId="4" w16cid:durableId="98528660">
+    <w:abstractNumId w:val="4"/>
+  </w:num>
+  <w:num w:numId="5" w16cid:durableId="618293466">
+    <w:abstractNumId w:val="6"/>
+  </w:num>
+  <w:num w:numId="6" w16cid:durableId="1747069160">
+    <w:abstractNumId w:val="2"/>
+  </w:num>
+  <w:num w:numId="7" w16cid:durableId="174923050">
+    <w:abstractNumId w:val="3"/>
+  </w:num>
+  <w:num w:numId="8" w16cid:durableId="2127892917">
+    <w:abstractNumId w:val="1"/>
   </w:num>
 </w:numbering>
 </file>

</xml_diff>